<commit_message>
refactor,dev: modified visualizations according to feedback, added visualization of hibernacula species count by season, re-saved two plots, re-knitted word document and knitted html
</commit_message>
<xml_diff>
--- a/code/from_Matt_Vinh/MV_2025-09-06.docx
+++ b/code/from_Matt_Vinh/MV_2025-09-06.docx
@@ -16,8 +16,2899 @@
       </w:pPr>
       <w:r>
         <w:rPr>
+          <w:rStyle w:val="NormalTok"/>
+        </w:rPr>
+        <w:t xml:space="preserve">knitr</w:t>
+      </w:r>
+      <w:r>
+        <w:rPr>
+          <w:rStyle w:val="SpecialCharTok"/>
+        </w:rPr>
+        <w:t xml:space="preserve">::</w:t>
+      </w:r>
+      <w:r>
+        <w:rPr>
+          <w:rStyle w:val="NormalTok"/>
+        </w:rPr>
+        <w:t xml:space="preserve">opts_chunk</w:t>
+      </w:r>
+      <w:r>
+        <w:rPr>
+          <w:rStyle w:val="SpecialCharTok"/>
+        </w:rPr>
+        <w:t xml:space="preserve">$</w:t>
+      </w:r>
+      <w:r>
+        <w:rPr>
+          <w:rStyle w:val="FunctionTok"/>
+        </w:rPr>
+        <w:t xml:space="preserve">set</w:t>
+      </w:r>
+      <w:r>
+        <w:rPr>
+          <w:rStyle w:val="NormalTok"/>
+        </w:rPr>
+        <w:t xml:space="preserve">(</w:t>
+      </w:r>
+      <w:r>
+        <w:rPr>
+          <w:rStyle w:val="AttributeTok"/>
+        </w:rPr>
+        <w:t xml:space="preserve">echo =</w:t>
+      </w:r>
+      <w:r>
+        <w:rPr>
+          <w:rStyle w:val="NormalTok"/>
+        </w:rPr>
+        <w:t xml:space="preserve"> </w:t>
+      </w:r>
+      <w:r>
+        <w:rPr>
+          <w:rStyle w:val="ConstantTok"/>
+        </w:rPr>
+        <w:t xml:space="preserve">TRUE</w:t>
+      </w:r>
+      <w:r>
+        <w:rPr>
+          <w:rStyle w:val="NormalTok"/>
+        </w:rPr>
+        <w:t xml:space="preserve">)</w:t>
+      </w:r>
+      <w:r>
+        <w:br/>
+      </w:r>
+      <w:r>
+        <w:rPr>
+          <w:rStyle w:val="FunctionTok"/>
+        </w:rPr>
+        <w:t xml:space="preserve">library</w:t>
+      </w:r>
+      <w:r>
+        <w:rPr>
+          <w:rStyle w:val="NormalTok"/>
+        </w:rPr>
+        <w:t xml:space="preserve">(tidyverse)</w:t>
+      </w:r>
+    </w:p>
+    <w:p>
+      <w:pPr>
+        <w:pStyle w:val="SourceCode"/>
+      </w:pPr>
+      <w:r>
+        <w:rPr>
+          <w:rStyle w:val="VerbatimChar"/>
+        </w:rPr>
+        <w:t xml:space="preserve">## ── Attaching core tidyverse packages ──────────────────────── tidyverse 2.0.0 ──</w:t>
+      </w:r>
+      <w:r>
+        <w:br/>
+      </w:r>
+      <w:r>
+        <w:rPr>
+          <w:rStyle w:val="VerbatimChar"/>
+        </w:rPr>
+        <w:t xml:space="preserve">## ✔ dplyr     1.1.4     ✔ readr     2.1.5</w:t>
+      </w:r>
+      <w:r>
+        <w:br/>
+      </w:r>
+      <w:r>
+        <w:rPr>
+          <w:rStyle w:val="VerbatimChar"/>
+        </w:rPr>
+        <w:t xml:space="preserve">## ✔ forcats   1.0.0     ✔ stringr   1.5.1</w:t>
+      </w:r>
+      <w:r>
+        <w:br/>
+      </w:r>
+      <w:r>
+        <w:rPr>
+          <w:rStyle w:val="VerbatimChar"/>
+        </w:rPr>
+        <w:t xml:space="preserve">## ✔ ggplot2   3.5.2     ✔ tibble    3.3.0</w:t>
+      </w:r>
+      <w:r>
+        <w:br/>
+      </w:r>
+      <w:r>
+        <w:rPr>
+          <w:rStyle w:val="VerbatimChar"/>
+        </w:rPr>
+        <w:t xml:space="preserve">## ✔ lubridate 1.9.4     ✔ tidyr     1.3.1</w:t>
+      </w:r>
+      <w:r>
+        <w:br/>
+      </w:r>
+      <w:r>
+        <w:rPr>
+          <w:rStyle w:val="VerbatimChar"/>
+        </w:rPr>
+        <w:t xml:space="preserve">## ✔ purrr     1.0.4     </w:t>
+      </w:r>
+      <w:r>
+        <w:br/>
+      </w:r>
+      <w:r>
+        <w:rPr>
+          <w:rStyle w:val="VerbatimChar"/>
+        </w:rPr>
+        <w:t xml:space="preserve">## ── Conflicts ────────────────────────────────────────── tidyverse_conflicts() ──</w:t>
+      </w:r>
+      <w:r>
+        <w:br/>
+      </w:r>
+      <w:r>
+        <w:rPr>
+          <w:rStyle w:val="VerbatimChar"/>
+        </w:rPr>
+        <w:t xml:space="preserve">## ✖ dplyr::filter() masks stats::filter()</w:t>
+      </w:r>
+      <w:r>
+        <w:br/>
+      </w:r>
+      <w:r>
+        <w:rPr>
+          <w:rStyle w:val="VerbatimChar"/>
+        </w:rPr>
+        <w:t xml:space="preserve">## ✖ dplyr::lag()    masks stats::lag()</w:t>
+      </w:r>
+      <w:r>
+        <w:br/>
+      </w:r>
+      <w:r>
+        <w:rPr>
+          <w:rStyle w:val="VerbatimChar"/>
+        </w:rPr>
+        <w:t xml:space="preserve">## ℹ Use the conflicted package (&lt;http://conflicted.r-lib.org/&gt;) to force all conflicts to become errors</w:t>
+      </w:r>
+    </w:p>
+    <w:p>
+      <w:pPr>
+        <w:pStyle w:val="SourceCode"/>
+      </w:pPr>
+      <w:r>
+        <w:rPr>
+          <w:rStyle w:val="FunctionTok"/>
+        </w:rPr>
+        <w:t xml:space="preserve">library</w:t>
+      </w:r>
+      <w:r>
+        <w:rPr>
+          <w:rStyle w:val="NormalTok"/>
+        </w:rPr>
+        <w:t xml:space="preserve">(here)</w:t>
+      </w:r>
+    </w:p>
+    <w:p>
+      <w:pPr>
+        <w:pStyle w:val="SourceCode"/>
+      </w:pPr>
+      <w:r>
+        <w:rPr>
+          <w:rStyle w:val="VerbatimChar"/>
+        </w:rPr>
+        <w:t xml:space="preserve">## here() starts at C:/Users/mattv/OneDrive/Desktop/Everything/Github/ncos-bird-surveys</w:t>
+      </w:r>
+    </w:p>
+    <w:p>
+      <w:pPr>
+        <w:pStyle w:val="SourceCode"/>
+      </w:pPr>
+      <w:r>
+        <w:rPr>
           <w:rStyle w:val="CommentTok"/>
         </w:rPr>
+        <w:t xml:space="preserve"># establishing ncos bird surveys .csv filepath using here package</w:t>
+      </w:r>
+      <w:r>
+        <w:br/>
+      </w:r>
+      <w:r>
+        <w:rPr>
+          <w:rStyle w:val="CommentTok"/>
+        </w:rPr>
+        <w:t xml:space="preserve"># removing unnecessary variables</w:t>
+      </w:r>
+      <w:r>
+        <w:br/>
+      </w:r>
+      <w:r>
+        <w:rPr>
+          <w:rStyle w:val="NormalTok"/>
+        </w:rPr>
+        <w:t xml:space="preserve">birdsurveyfilepath </w:t>
+      </w:r>
+      <w:r>
+        <w:rPr>
+          <w:rStyle w:val="OtherTok"/>
+        </w:rPr>
+        <w:t xml:space="preserve">&lt;-</w:t>
+      </w:r>
+      <w:r>
+        <w:rPr>
+          <w:rStyle w:val="NormalTok"/>
+        </w:rPr>
+        <w:t xml:space="preserve"> </w:t>
+      </w:r>
+      <w:r>
+        <w:rPr>
+          <w:rStyle w:val="FunctionTok"/>
+        </w:rPr>
+        <w:t xml:space="preserve">here</w:t>
+      </w:r>
+      <w:r>
+        <w:rPr>
+          <w:rStyle w:val="NormalTok"/>
+        </w:rPr>
+        <w:t xml:space="preserve">(</w:t>
+      </w:r>
+      <w:r>
+        <w:rPr>
+          <w:rStyle w:val="StringTok"/>
+        </w:rPr>
+        <w:t xml:space="preserve">"data"</w:t>
+      </w:r>
+      <w:r>
+        <w:rPr>
+          <w:rStyle w:val="NormalTok"/>
+        </w:rPr>
+        <w:t xml:space="preserve">,</w:t>
+      </w:r>
+      <w:r>
+        <w:rPr>
+          <w:rStyle w:val="StringTok"/>
+        </w:rPr>
+        <w:t xml:space="preserve">"aggregated"</w:t>
+      </w:r>
+      <w:r>
+        <w:rPr>
+          <w:rStyle w:val="NormalTok"/>
+        </w:rPr>
+        <w:t xml:space="preserve">,</w:t>
+      </w:r>
+      <w:r>
+        <w:rPr>
+          <w:rStyle w:val="StringTok"/>
+        </w:rPr>
+        <w:t xml:space="preserve">"dryad_2017-2023"</w:t>
+      </w:r>
+      <w:r>
+        <w:rPr>
+          <w:rStyle w:val="NormalTok"/>
+        </w:rPr>
+        <w:t xml:space="preserve">,</w:t>
+      </w:r>
+      <w:r>
+        <w:rPr>
+          <w:rStyle w:val="StringTok"/>
+        </w:rPr>
+        <w:t xml:space="preserve">"doi_10_5061_dryad_bvq83bkhz__v20240617"</w:t>
+      </w:r>
+      <w:r>
+        <w:rPr>
+          <w:rStyle w:val="NormalTok"/>
+        </w:rPr>
+        <w:t xml:space="preserve">,</w:t>
+      </w:r>
+      <w:r>
+        <w:rPr>
+          <w:rStyle w:val="StringTok"/>
+        </w:rPr>
+        <w:t xml:space="preserve">"NCOS_Monthly_Bird_Surveys_2017-2023.csv"</w:t>
+      </w:r>
+      <w:r>
+        <w:rPr>
+          <w:rStyle w:val="NormalTok"/>
+        </w:rPr>
+        <w:t xml:space="preserve">)</w:t>
+      </w:r>
+      <w:r>
+        <w:br/>
+      </w:r>
+      <w:r>
+        <w:rPr>
+          <w:rStyle w:val="NormalTok"/>
+        </w:rPr>
+        <w:t xml:space="preserve">birdsurveys </w:t>
+      </w:r>
+      <w:r>
+        <w:rPr>
+          <w:rStyle w:val="OtherTok"/>
+        </w:rPr>
+        <w:t xml:space="preserve">&lt;-</w:t>
+      </w:r>
+      <w:r>
+        <w:rPr>
+          <w:rStyle w:val="NormalTok"/>
+        </w:rPr>
+        <w:t xml:space="preserve"> </w:t>
+      </w:r>
+      <w:r>
+        <w:rPr>
+          <w:rStyle w:val="FunctionTok"/>
+        </w:rPr>
+        <w:t xml:space="preserve">read_csv</w:t>
+      </w:r>
+      <w:r>
+        <w:rPr>
+          <w:rStyle w:val="NormalTok"/>
+        </w:rPr>
+        <w:t xml:space="preserve">(birdsurveyfilepath)</w:t>
+      </w:r>
+    </w:p>
+    <w:p>
+      <w:pPr>
+        <w:pStyle w:val="SourceCode"/>
+      </w:pPr>
+      <w:r>
+        <w:rPr>
+          <w:rStyle w:val="VerbatimChar"/>
+        </w:rPr>
+        <w:t xml:space="preserve">## Rows: 11351 Columns: 11</w:t>
+      </w:r>
+      <w:r>
+        <w:br/>
+      </w:r>
+      <w:r>
+        <w:rPr>
+          <w:rStyle w:val="VerbatimChar"/>
+        </w:rPr>
+        <w:t xml:space="preserve">## ── Column specification ────────────────────────────────────────────────────────</w:t>
+      </w:r>
+      <w:r>
+        <w:br/>
+      </w:r>
+      <w:r>
+        <w:rPr>
+          <w:rStyle w:val="VerbatimChar"/>
+        </w:rPr>
+        <w:t xml:space="preserve">## Delimiter: ","</w:t>
+      </w:r>
+      <w:r>
+        <w:br/>
+      </w:r>
+      <w:r>
+        <w:rPr>
+          <w:rStyle w:val="VerbatimChar"/>
+        </w:rPr>
+        <w:t xml:space="preserve">## chr (8): Observation.Date, Species, General.Type, eBird.Group, Substrate, Re...</w:t>
+      </w:r>
+      <w:r>
+        <w:br/>
+      </w:r>
+      <w:r>
+        <w:rPr>
+          <w:rStyle w:val="VerbatimChar"/>
+        </w:rPr>
+        <w:t xml:space="preserve">## dbl (3): Year, Count, Slough.Water.Elevation..ft.</w:t>
+      </w:r>
+      <w:r>
+        <w:br/>
+      </w:r>
+      <w:r>
+        <w:rPr>
+          <w:rStyle w:val="VerbatimChar"/>
+        </w:rPr>
+        <w:t xml:space="preserve">## </w:t>
+      </w:r>
+      <w:r>
+        <w:br/>
+      </w:r>
+      <w:r>
+        <w:rPr>
+          <w:rStyle w:val="VerbatimChar"/>
+        </w:rPr>
+        <w:t xml:space="preserve">## ℹ Use `spec()` to retrieve the full column specification for this data.</w:t>
+      </w:r>
+      <w:r>
+        <w:br/>
+      </w:r>
+      <w:r>
+        <w:rPr>
+          <w:rStyle w:val="VerbatimChar"/>
+        </w:rPr>
+        <w:t xml:space="preserve">## ℹ Specify the column types or set `show_col_types = FALSE` to quiet this message.</w:t>
+      </w:r>
+    </w:p>
+    <w:p>
+      <w:pPr>
+        <w:pStyle w:val="SourceCode"/>
+      </w:pPr>
+      <w:r>
+        <w:rPr>
+          <w:rStyle w:val="NormalTok"/>
+        </w:rPr>
+        <w:t xml:space="preserve">birdsurveys_filtered </w:t>
+      </w:r>
+      <w:r>
+        <w:rPr>
+          <w:rStyle w:val="OtherTok"/>
+        </w:rPr>
+        <w:t xml:space="preserve">&lt;-</w:t>
+      </w:r>
+      <w:r>
+        <w:rPr>
+          <w:rStyle w:val="NormalTok"/>
+        </w:rPr>
+        <w:t xml:space="preserve"> birdsurveys </w:t>
+      </w:r>
+      <w:r>
+        <w:rPr>
+          <w:rStyle w:val="SpecialCharTok"/>
+        </w:rPr>
+        <w:t xml:space="preserve">%&gt;%</w:t>
+      </w:r>
+      <w:r>
+        <w:br/>
+      </w:r>
+      <w:r>
+        <w:rPr>
+          <w:rStyle w:val="NormalTok"/>
+        </w:rPr>
+        <w:t xml:space="preserve">  </w:t>
+      </w:r>
+      <w:r>
+        <w:rPr>
+          <w:rStyle w:val="FunctionTok"/>
+        </w:rPr>
+        <w:t xml:space="preserve">select</w:t>
+      </w:r>
+      <w:r>
+        <w:rPr>
+          <w:rStyle w:val="NormalTok"/>
+        </w:rPr>
+        <w:t xml:space="preserve">(</w:t>
+      </w:r>
+      <w:r>
+        <w:rPr>
+          <w:rStyle w:val="SpecialCharTok"/>
+        </w:rPr>
+        <w:t xml:space="preserve">-</w:t>
+      </w:r>
+      <w:r>
+        <w:rPr>
+          <w:rStyle w:val="FunctionTok"/>
+        </w:rPr>
+        <w:t xml:space="preserve">c</w:t>
+      </w:r>
+      <w:r>
+        <w:rPr>
+          <w:rStyle w:val="NormalTok"/>
+        </w:rPr>
+        <w:t xml:space="preserve">(Repeat.Observation</w:t>
+      </w:r>
+      <w:r>
+        <w:rPr>
+          <w:rStyle w:val="SpecialCharTok"/>
+        </w:rPr>
+        <w:t xml:space="preserve">:</w:t>
+      </w:r>
+      <w:r>
+        <w:rPr>
+          <w:rStyle w:val="NormalTok"/>
+        </w:rPr>
+        <w:t xml:space="preserve">Slough.Water.Elevation..ft.)) </w:t>
+      </w:r>
+      <w:r>
+        <w:rPr>
+          <w:rStyle w:val="SpecialCharTok"/>
+        </w:rPr>
+        <w:t xml:space="preserve">%&gt;%</w:t>
+      </w:r>
+      <w:r>
+        <w:rPr>
+          <w:rStyle w:val="NormalTok"/>
+        </w:rPr>
+        <w:t xml:space="preserve"> </w:t>
+      </w:r>
+      <w:r>
+        <w:br/>
+      </w:r>
+      <w:r>
+        <w:rPr>
+          <w:rStyle w:val="NormalTok"/>
+        </w:rPr>
+        <w:t xml:space="preserve">  </w:t>
+      </w:r>
+      <w:r>
+        <w:rPr>
+          <w:rStyle w:val="FunctionTok"/>
+        </w:rPr>
+        <w:t xml:space="preserve">filter</w:t>
+      </w:r>
+      <w:r>
+        <w:rPr>
+          <w:rStyle w:val="NormalTok"/>
+        </w:rPr>
+        <w:t xml:space="preserve">(Substrate </w:t>
+      </w:r>
+      <w:r>
+        <w:rPr>
+          <w:rStyle w:val="SpecialCharTok"/>
+        </w:rPr>
+        <w:t xml:space="preserve">!=</w:t>
+      </w:r>
+      <w:r>
+        <w:rPr>
+          <w:rStyle w:val="NormalTok"/>
+        </w:rPr>
+        <w:t xml:space="preserve"> </w:t>
+      </w:r>
+      <w:r>
+        <w:rPr>
+          <w:rStyle w:val="StringTok"/>
+        </w:rPr>
+        <w:t xml:space="preserve">"&lt;Null&gt;"</w:t>
+      </w:r>
+      <w:r>
+        <w:rPr>
+          <w:rStyle w:val="NormalTok"/>
+        </w:rPr>
+        <w:t xml:space="preserve"> </w:t>
+      </w:r>
+      <w:r>
+        <w:rPr>
+          <w:rStyle w:val="SpecialCharTok"/>
+        </w:rPr>
+        <w:t xml:space="preserve">&amp;</w:t>
+      </w:r>
+      <w:r>
+        <w:rPr>
+          <w:rStyle w:val="NormalTok"/>
+        </w:rPr>
+        <w:t xml:space="preserve"> </w:t>
+      </w:r>
+      <w:r>
+        <w:rPr>
+          <w:rStyle w:val="SpecialCharTok"/>
+        </w:rPr>
+        <w:t xml:space="preserve">!</w:t>
+      </w:r>
+      <w:r>
+        <w:rPr>
+          <w:rStyle w:val="FunctionTok"/>
+        </w:rPr>
+        <w:t xml:space="preserve">is.na</w:t>
+      </w:r>
+      <w:r>
+        <w:rPr>
+          <w:rStyle w:val="NormalTok"/>
+        </w:rPr>
+        <w:t xml:space="preserve">(Count))</w:t>
+      </w:r>
+      <w:r>
+        <w:br/>
+      </w:r>
+      <w:r>
+        <w:rPr>
+          <w:rStyle w:val="NormalTok"/>
+        </w:rPr>
+        <w:t xml:space="preserve">birdsurveys_filtered</w:t>
+      </w:r>
+      <w:r>
+        <w:rPr>
+          <w:rStyle w:val="SpecialCharTok"/>
+        </w:rPr>
+        <w:t xml:space="preserve">$</w:t>
+      </w:r>
+      <w:r>
+        <w:rPr>
+          <w:rStyle w:val="NormalTok"/>
+        </w:rPr>
+        <w:t xml:space="preserve">Substrate[birdsurveys_filtered</w:t>
+      </w:r>
+      <w:r>
+        <w:rPr>
+          <w:rStyle w:val="SpecialCharTok"/>
+        </w:rPr>
+        <w:t xml:space="preserve">$</w:t>
+      </w:r>
+      <w:r>
+        <w:rPr>
+          <w:rStyle w:val="NormalTok"/>
+        </w:rPr>
+        <w:t xml:space="preserve">Substrate </w:t>
+      </w:r>
+      <w:r>
+        <w:rPr>
+          <w:rStyle w:val="SpecialCharTok"/>
+        </w:rPr>
+        <w:t xml:space="preserve">==</w:t>
+      </w:r>
+      <w:r>
+        <w:rPr>
+          <w:rStyle w:val="NormalTok"/>
+        </w:rPr>
+        <w:t xml:space="preserve"> </w:t>
+      </w:r>
+      <w:r>
+        <w:rPr>
+          <w:rStyle w:val="StringTok"/>
+        </w:rPr>
+        <w:t xml:space="preserve">"rocks"</w:t>
+      </w:r>
+      <w:r>
+        <w:rPr>
+          <w:rStyle w:val="NormalTok"/>
+        </w:rPr>
+        <w:t xml:space="preserve">] </w:t>
+      </w:r>
+      <w:r>
+        <w:rPr>
+          <w:rStyle w:val="OtherTok"/>
+        </w:rPr>
+        <w:t xml:space="preserve">&lt;-</w:t>
+      </w:r>
+      <w:r>
+        <w:rPr>
+          <w:rStyle w:val="NormalTok"/>
+        </w:rPr>
+        <w:t xml:space="preserve"> </w:t>
+      </w:r>
+      <w:r>
+        <w:rPr>
+          <w:rStyle w:val="StringTok"/>
+        </w:rPr>
+        <w:t xml:space="preserve">"Rock"</w:t>
+      </w:r>
+      <w:r>
+        <w:br/>
+      </w:r>
+      <w:r>
+        <w:rPr>
+          <w:rStyle w:val="NormalTok"/>
+        </w:rPr>
+        <w:t xml:space="preserve">birdsurveys_filtered</w:t>
+      </w:r>
+      <w:r>
+        <w:rPr>
+          <w:rStyle w:val="SpecialCharTok"/>
+        </w:rPr>
+        <w:t xml:space="preserve">$</w:t>
+      </w:r>
+      <w:r>
+        <w:rPr>
+          <w:rStyle w:val="NormalTok"/>
+        </w:rPr>
+        <w:t xml:space="preserve">Substrate[birdsurveys_filtered</w:t>
+      </w:r>
+      <w:r>
+        <w:rPr>
+          <w:rStyle w:val="SpecialCharTok"/>
+        </w:rPr>
+        <w:t xml:space="preserve">$</w:t>
+      </w:r>
+      <w:r>
+        <w:rPr>
+          <w:rStyle w:val="NormalTok"/>
+        </w:rPr>
+        <w:t xml:space="preserve">Substrate </w:t>
+      </w:r>
+      <w:r>
+        <w:rPr>
+          <w:rStyle w:val="SpecialCharTok"/>
+        </w:rPr>
+        <w:t xml:space="preserve">==</w:t>
+      </w:r>
+      <w:r>
+        <w:rPr>
+          <w:rStyle w:val="NormalTok"/>
+        </w:rPr>
+        <w:t xml:space="preserve"> </w:t>
+      </w:r>
+      <w:r>
+        <w:br/>
+      </w:r>
+      <w:r>
+        <w:rPr>
+          <w:rStyle w:val="NormalTok"/>
+        </w:rPr>
+        <w:t xml:space="preserve">                                 </w:t>
+      </w:r>
+      <w:r>
+        <w:rPr>
+          <w:rStyle w:val="StringTok"/>
+        </w:rPr>
+        <w:t xml:space="preserve">"Other (Enter in Observation Notes)"</w:t>
+      </w:r>
+      <w:r>
+        <w:rPr>
+          <w:rStyle w:val="NormalTok"/>
+        </w:rPr>
+        <w:t xml:space="preserve">] </w:t>
+      </w:r>
+      <w:r>
+        <w:rPr>
+          <w:rStyle w:val="OtherTok"/>
+        </w:rPr>
+        <w:t xml:space="preserve">&lt;-</w:t>
+      </w:r>
+      <w:r>
+        <w:rPr>
+          <w:rStyle w:val="NormalTok"/>
+        </w:rPr>
+        <w:t xml:space="preserve"> </w:t>
+      </w:r>
+      <w:r>
+        <w:rPr>
+          <w:rStyle w:val="StringTok"/>
+        </w:rPr>
+        <w:t xml:space="preserve">"Other"</w:t>
+      </w:r>
+      <w:r>
+        <w:br/>
+      </w:r>
+      <w:r>
+        <w:br/>
+      </w:r>
+      <w:r>
+        <w:rPr>
+          <w:rStyle w:val="CommentTok"/>
+        </w:rPr>
+        <w:t xml:space="preserve"># establishing aos checklist nacc species list .csv using here package</w:t>
+      </w:r>
+      <w:r>
+        <w:br/>
+      </w:r>
+      <w:r>
+        <w:rPr>
+          <w:rStyle w:val="CommentTok"/>
+        </w:rPr>
+        <w:t xml:space="preserve"># removing unnecessary variables</w:t>
+      </w:r>
+      <w:r>
+        <w:br/>
+      </w:r>
+      <w:r>
+        <w:rPr>
+          <w:rStyle w:val="NormalTok"/>
+        </w:rPr>
+        <w:t xml:space="preserve">naccfilepath </w:t>
+      </w:r>
+      <w:r>
+        <w:rPr>
+          <w:rStyle w:val="OtherTok"/>
+        </w:rPr>
+        <w:t xml:space="preserve">&lt;-</w:t>
+      </w:r>
+      <w:r>
+        <w:rPr>
+          <w:rStyle w:val="NormalTok"/>
+        </w:rPr>
+        <w:t xml:space="preserve"> </w:t>
+      </w:r>
+      <w:r>
+        <w:rPr>
+          <w:rStyle w:val="FunctionTok"/>
+        </w:rPr>
+        <w:t xml:space="preserve">here</w:t>
+      </w:r>
+      <w:r>
+        <w:rPr>
+          <w:rStyle w:val="NormalTok"/>
+        </w:rPr>
+        <w:t xml:space="preserve">(</w:t>
+      </w:r>
+      <w:r>
+        <w:rPr>
+          <w:rStyle w:val="StringTok"/>
+        </w:rPr>
+        <w:t xml:space="preserve">"data"</w:t>
+      </w:r>
+      <w:r>
+        <w:rPr>
+          <w:rStyle w:val="NormalTok"/>
+        </w:rPr>
+        <w:t xml:space="preserve">,</w:t>
+      </w:r>
+      <w:r>
+        <w:rPr>
+          <w:rStyle w:val="StringTok"/>
+        </w:rPr>
+        <w:t xml:space="preserve">"aos_checklist"</w:t>
+      </w:r>
+      <w:r>
+        <w:rPr>
+          <w:rStyle w:val="NormalTok"/>
+        </w:rPr>
+        <w:t xml:space="preserve">,</w:t>
+      </w:r>
+      <w:r>
+        <w:rPr>
+          <w:rStyle w:val="StringTok"/>
+        </w:rPr>
+        <w:t xml:space="preserve">"NACC_list_species_2024_65th.csv"</w:t>
+      </w:r>
+      <w:r>
+        <w:rPr>
+          <w:rStyle w:val="NormalTok"/>
+        </w:rPr>
+        <w:t xml:space="preserve">)</w:t>
+      </w:r>
+      <w:r>
+        <w:br/>
+      </w:r>
+      <w:r>
+        <w:rPr>
+          <w:rStyle w:val="NormalTok"/>
+        </w:rPr>
+        <w:t xml:space="preserve">nacc </w:t>
+      </w:r>
+      <w:r>
+        <w:rPr>
+          <w:rStyle w:val="OtherTok"/>
+        </w:rPr>
+        <w:t xml:space="preserve">&lt;-</w:t>
+      </w:r>
+      <w:r>
+        <w:rPr>
+          <w:rStyle w:val="NormalTok"/>
+        </w:rPr>
+        <w:t xml:space="preserve"> </w:t>
+      </w:r>
+      <w:r>
+        <w:rPr>
+          <w:rStyle w:val="FunctionTok"/>
+        </w:rPr>
+        <w:t xml:space="preserve">read_csv</w:t>
+      </w:r>
+      <w:r>
+        <w:rPr>
+          <w:rStyle w:val="NormalTok"/>
+        </w:rPr>
+        <w:t xml:space="preserve">(naccfilepath)</w:t>
+      </w:r>
+    </w:p>
+    <w:p>
+      <w:pPr>
+        <w:pStyle w:val="SourceCode"/>
+      </w:pPr>
+      <w:r>
+        <w:rPr>
+          <w:rStyle w:val="VerbatimChar"/>
+        </w:rPr>
+        <w:t xml:space="preserve">## Rows: 2202 Columns: 16</w:t>
+      </w:r>
+      <w:r>
+        <w:br/>
+      </w:r>
+      <w:r>
+        <w:rPr>
+          <w:rStyle w:val="VerbatimChar"/>
+        </w:rPr>
+        <w:t xml:space="preserve">## ── Column specification ────────────────────────────────────────────────────────</w:t>
+      </w:r>
+      <w:r>
+        <w:br/>
+      </w:r>
+      <w:r>
+        <w:rPr>
+          <w:rStyle w:val="VerbatimChar"/>
+        </w:rPr>
+        <w:t xml:space="preserve">## Delimiter: ","</w:t>
+      </w:r>
+      <w:r>
+        <w:br/>
+      </w:r>
+      <w:r>
+        <w:rPr>
+          <w:rStyle w:val="VerbatimChar"/>
+        </w:rPr>
+        <w:t xml:space="preserve">## chr (15): rank, common_name, french_name, order, family, subfamily, genus, s...</w:t>
+      </w:r>
+      <w:r>
+        <w:br/>
+      </w:r>
+      <w:r>
+        <w:rPr>
+          <w:rStyle w:val="VerbatimChar"/>
+        </w:rPr>
+        <w:t xml:space="preserve">## dbl  (1): id</w:t>
+      </w:r>
+      <w:r>
+        <w:br/>
+      </w:r>
+      <w:r>
+        <w:rPr>
+          <w:rStyle w:val="VerbatimChar"/>
+        </w:rPr>
+        <w:t xml:space="preserve">## </w:t>
+      </w:r>
+      <w:r>
+        <w:br/>
+      </w:r>
+      <w:r>
+        <w:rPr>
+          <w:rStyle w:val="VerbatimChar"/>
+        </w:rPr>
+        <w:t xml:space="preserve">## ℹ Use `spec()` to retrieve the full column specification for this data.</w:t>
+      </w:r>
+      <w:r>
+        <w:br/>
+      </w:r>
+      <w:r>
+        <w:rPr>
+          <w:rStyle w:val="VerbatimChar"/>
+        </w:rPr>
+        <w:t xml:space="preserve">## ℹ Specify the column types or set `show_col_types = FALSE` to quiet this message.</w:t>
+      </w:r>
+    </w:p>
+    <w:p>
+      <w:pPr>
+        <w:pStyle w:val="SourceCode"/>
+      </w:pPr>
+      <w:r>
+        <w:rPr>
+          <w:rStyle w:val="NormalTok"/>
+        </w:rPr>
+        <w:t xml:space="preserve">nacc_filtered </w:t>
+      </w:r>
+      <w:r>
+        <w:rPr>
+          <w:rStyle w:val="OtherTok"/>
+        </w:rPr>
+        <w:t xml:space="preserve">&lt;-</w:t>
+      </w:r>
+      <w:r>
+        <w:rPr>
+          <w:rStyle w:val="NormalTok"/>
+        </w:rPr>
+        <w:t xml:space="preserve"> nacc </w:t>
+      </w:r>
+      <w:r>
+        <w:rPr>
+          <w:rStyle w:val="SpecialCharTok"/>
+        </w:rPr>
+        <w:t xml:space="preserve">%&gt;%</w:t>
+      </w:r>
+      <w:r>
+        <w:rPr>
+          <w:rStyle w:val="NormalTok"/>
+        </w:rPr>
+        <w:t xml:space="preserve"> </w:t>
+      </w:r>
+      <w:r>
+        <w:rPr>
+          <w:rStyle w:val="FunctionTok"/>
+        </w:rPr>
+        <w:t xml:space="preserve">select</w:t>
+      </w:r>
+      <w:r>
+        <w:rPr>
+          <w:rStyle w:val="NormalTok"/>
+        </w:rPr>
+        <w:t xml:space="preserve">(</w:t>
+      </w:r>
+      <w:r>
+        <w:rPr>
+          <w:rStyle w:val="SpecialCharTok"/>
+        </w:rPr>
+        <w:t xml:space="preserve">-</w:t>
+      </w:r>
+      <w:r>
+        <w:rPr>
+          <w:rStyle w:val="FunctionTok"/>
+        </w:rPr>
+        <w:t xml:space="preserve">c</w:t>
+      </w:r>
+      <w:r>
+        <w:rPr>
+          <w:rStyle w:val="NormalTok"/>
+        </w:rPr>
+        <w:t xml:space="preserve">(french_name,annotation</w:t>
+      </w:r>
+      <w:r>
+        <w:rPr>
+          <w:rStyle w:val="SpecialCharTok"/>
+        </w:rPr>
+        <w:t xml:space="preserve">:</w:t>
+      </w:r>
+      <w:r>
+        <w:rPr>
+          <w:rStyle w:val="NormalTok"/>
+        </w:rPr>
+        <w:t xml:space="preserve">status_misplaced))</w:t>
+      </w:r>
+      <w:r>
+        <w:br/>
+      </w:r>
+      <w:r>
+        <w:br/>
+      </w:r>
+      <w:r>
+        <w:rPr>
+          <w:rStyle w:val="CommentTok"/>
+        </w:rPr>
+        <w:t xml:space="preserve"># creating date variable with correct data type with lubridate package (tidyverse)</w:t>
+      </w:r>
+      <w:r>
+        <w:br/>
+      </w:r>
+      <w:r>
+        <w:rPr>
+          <w:rStyle w:val="CommentTok"/>
+        </w:rPr>
+        <w:t xml:space="preserve"># removing NA dates</w:t>
+      </w:r>
+      <w:r>
+        <w:br/>
+      </w:r>
+      <w:r>
+        <w:rPr>
+          <w:rStyle w:val="NormalTok"/>
+        </w:rPr>
+        <w:t xml:space="preserve">birdsurveys_filtered</w:t>
+      </w:r>
+      <w:r>
+        <w:rPr>
+          <w:rStyle w:val="SpecialCharTok"/>
+        </w:rPr>
+        <w:t xml:space="preserve">$</w:t>
+      </w:r>
+      <w:r>
+        <w:rPr>
+          <w:rStyle w:val="NormalTok"/>
+        </w:rPr>
+        <w:t xml:space="preserve">obs_date2 </w:t>
+      </w:r>
+      <w:r>
+        <w:rPr>
+          <w:rStyle w:val="OtherTok"/>
+        </w:rPr>
+        <w:t xml:space="preserve">&lt;-</w:t>
+      </w:r>
+      <w:r>
+        <w:rPr>
+          <w:rStyle w:val="NormalTok"/>
+        </w:rPr>
+        <w:t xml:space="preserve"> </w:t>
+      </w:r>
+      <w:r>
+        <w:rPr>
+          <w:rStyle w:val="FunctionTok"/>
+        </w:rPr>
+        <w:t xml:space="preserve">substr</w:t>
+      </w:r>
+      <w:r>
+        <w:rPr>
+          <w:rStyle w:val="NormalTok"/>
+        </w:rPr>
+        <w:t xml:space="preserve">(birdsurveys_filtered</w:t>
+      </w:r>
+      <w:r>
+        <w:rPr>
+          <w:rStyle w:val="SpecialCharTok"/>
+        </w:rPr>
+        <w:t xml:space="preserve">$</w:t>
+      </w:r>
+      <w:r>
+        <w:rPr>
+          <w:rStyle w:val="NormalTok"/>
+        </w:rPr>
+        <w:t xml:space="preserve">Observation.Date,</w:t>
+      </w:r>
+      <w:r>
+        <w:rPr>
+          <w:rStyle w:val="DecValTok"/>
+        </w:rPr>
+        <w:t xml:space="preserve">1</w:t>
+      </w:r>
+      <w:r>
+        <w:rPr>
+          <w:rStyle w:val="NormalTok"/>
+        </w:rPr>
+        <w:t xml:space="preserve">,</w:t>
+      </w:r>
+      <w:r>
+        <w:rPr>
+          <w:rStyle w:val="DecValTok"/>
+        </w:rPr>
+        <w:t xml:space="preserve">10</w:t>
+      </w:r>
+      <w:r>
+        <w:rPr>
+          <w:rStyle w:val="NormalTok"/>
+        </w:rPr>
+        <w:t xml:space="preserve">)</w:t>
+      </w:r>
+      <w:r>
+        <w:br/>
+      </w:r>
+      <w:r>
+        <w:rPr>
+          <w:rStyle w:val="NormalTok"/>
+        </w:rPr>
+        <w:t xml:space="preserve">birdsurveys_filtered </w:t>
+      </w:r>
+      <w:r>
+        <w:rPr>
+          <w:rStyle w:val="OtherTok"/>
+        </w:rPr>
+        <w:t xml:space="preserve">&lt;-</w:t>
+      </w:r>
+      <w:r>
+        <w:rPr>
+          <w:rStyle w:val="NormalTok"/>
+        </w:rPr>
+        <w:t xml:space="preserve"> birdsurveys_filtered </w:t>
+      </w:r>
+      <w:r>
+        <w:rPr>
+          <w:rStyle w:val="SpecialCharTok"/>
+        </w:rPr>
+        <w:t xml:space="preserve">%&gt;%</w:t>
+      </w:r>
+      <w:r>
+        <w:rPr>
+          <w:rStyle w:val="NormalTok"/>
+        </w:rPr>
+        <w:t xml:space="preserve"> </w:t>
+      </w:r>
+      <w:r>
+        <w:br/>
+      </w:r>
+      <w:r>
+        <w:rPr>
+          <w:rStyle w:val="NormalTok"/>
+        </w:rPr>
+        <w:t xml:space="preserve">  </w:t>
+      </w:r>
+      <w:r>
+        <w:rPr>
+          <w:rStyle w:val="FunctionTok"/>
+        </w:rPr>
+        <w:t xml:space="preserve">mutate</w:t>
+      </w:r>
+      <w:r>
+        <w:rPr>
+          <w:rStyle w:val="NormalTok"/>
+        </w:rPr>
+        <w:t xml:space="preserve">(</w:t>
+      </w:r>
+      <w:r>
+        <w:rPr>
+          <w:rStyle w:val="AttributeTok"/>
+        </w:rPr>
+        <w:t xml:space="preserve">obs_date3 =</w:t>
+      </w:r>
+      <w:r>
+        <w:rPr>
+          <w:rStyle w:val="NormalTok"/>
+        </w:rPr>
+        <w:t xml:space="preserve"> </w:t>
+      </w:r>
+      <w:r>
+        <w:rPr>
+          <w:rStyle w:val="FunctionTok"/>
+        </w:rPr>
+        <w:t xml:space="preserve">parse_date_time</w:t>
+      </w:r>
+      <w:r>
+        <w:rPr>
+          <w:rStyle w:val="NormalTok"/>
+        </w:rPr>
+        <w:t xml:space="preserve">(obs_date2,</w:t>
+      </w:r>
+      <w:r>
+        <w:rPr>
+          <w:rStyle w:val="AttributeTok"/>
+        </w:rPr>
+        <w:t xml:space="preserve">orders =</w:t>
+      </w:r>
+      <w:r>
+        <w:rPr>
+          <w:rStyle w:val="NormalTok"/>
+        </w:rPr>
+        <w:t xml:space="preserve"> </w:t>
+      </w:r>
+      <w:r>
+        <w:rPr>
+          <w:rStyle w:val="FunctionTok"/>
+        </w:rPr>
+        <w:t xml:space="preserve">c</w:t>
+      </w:r>
+      <w:r>
+        <w:rPr>
+          <w:rStyle w:val="NormalTok"/>
+        </w:rPr>
+        <w:t xml:space="preserve">(</w:t>
+      </w:r>
+      <w:r>
+        <w:rPr>
+          <w:rStyle w:val="StringTok"/>
+        </w:rPr>
+        <w:t xml:space="preserve">"mdy"</w:t>
+      </w:r>
+      <w:r>
+        <w:rPr>
+          <w:rStyle w:val="NormalTok"/>
+        </w:rPr>
+        <w:t xml:space="preserve">,</w:t>
+      </w:r>
+      <w:r>
+        <w:rPr>
+          <w:rStyle w:val="StringTok"/>
+        </w:rPr>
+        <w:t xml:space="preserve">"ymd"</w:t>
+      </w:r>
+      <w:r>
+        <w:rPr>
+          <w:rStyle w:val="NormalTok"/>
+        </w:rPr>
+        <w:t xml:space="preserve">))) </w:t>
+      </w:r>
+      <w:r>
+        <w:rPr>
+          <w:rStyle w:val="SpecialCharTok"/>
+        </w:rPr>
+        <w:t xml:space="preserve">%&gt;%</w:t>
+      </w:r>
+      <w:r>
+        <w:rPr>
+          <w:rStyle w:val="NormalTok"/>
+        </w:rPr>
+        <w:t xml:space="preserve"> </w:t>
+      </w:r>
+      <w:r>
+        <w:br/>
+      </w:r>
+      <w:r>
+        <w:rPr>
+          <w:rStyle w:val="NormalTok"/>
+        </w:rPr>
+        <w:t xml:space="preserve">  </w:t>
+      </w:r>
+      <w:r>
+        <w:rPr>
+          <w:rStyle w:val="FunctionTok"/>
+        </w:rPr>
+        <w:t xml:space="preserve">filter</w:t>
+      </w:r>
+      <w:r>
+        <w:rPr>
+          <w:rStyle w:val="NormalTok"/>
+        </w:rPr>
+        <w:t xml:space="preserve">(</w:t>
+      </w:r>
+      <w:r>
+        <w:rPr>
+          <w:rStyle w:val="SpecialCharTok"/>
+        </w:rPr>
+        <w:t xml:space="preserve">!</w:t>
+      </w:r>
+      <w:r>
+        <w:rPr>
+          <w:rStyle w:val="FunctionTok"/>
+        </w:rPr>
+        <w:t xml:space="preserve">is.na</w:t>
+      </w:r>
+      <w:r>
+        <w:rPr>
+          <w:rStyle w:val="NormalTok"/>
+        </w:rPr>
+        <w:t xml:space="preserve">(obs_date3))</w:t>
+      </w:r>
+      <w:r>
+        <w:br/>
+      </w:r>
+      <w:r>
+        <w:br/>
+      </w:r>
+      <w:r>
+        <w:rPr>
+          <w:rStyle w:val="CommentTok"/>
+        </w:rPr>
+        <w:t xml:space="preserve"># creating variable for survey year as opposed to calendar year</w:t>
+      </w:r>
+      <w:r>
+        <w:br/>
+      </w:r>
+      <w:r>
+        <w:rPr>
+          <w:rStyle w:val="NormalTok"/>
+        </w:rPr>
+        <w:t xml:space="preserve">date_borders </w:t>
+      </w:r>
+      <w:r>
+        <w:rPr>
+          <w:rStyle w:val="OtherTok"/>
+        </w:rPr>
+        <w:t xml:space="preserve">&lt;-</w:t>
+      </w:r>
+      <w:r>
+        <w:rPr>
+          <w:rStyle w:val="NormalTok"/>
+        </w:rPr>
+        <w:t xml:space="preserve"> </w:t>
+      </w:r>
+      <w:r>
+        <w:rPr>
+          <w:rStyle w:val="FunctionTok"/>
+        </w:rPr>
+        <w:t xml:space="preserve">ymd</w:t>
+      </w:r>
+      <w:r>
+        <w:rPr>
+          <w:rStyle w:val="NormalTok"/>
+        </w:rPr>
+        <w:t xml:space="preserve">(</w:t>
+      </w:r>
+      <w:r>
+        <w:rPr>
+          <w:rStyle w:val="FunctionTok"/>
+        </w:rPr>
+        <w:t xml:space="preserve">c</w:t>
+      </w:r>
+      <w:r>
+        <w:rPr>
+          <w:rStyle w:val="NormalTok"/>
+        </w:rPr>
+        <w:t xml:space="preserve">(</w:t>
+      </w:r>
+      <w:r>
+        <w:rPr>
+          <w:rStyle w:val="StringTok"/>
+        </w:rPr>
+        <w:t xml:space="preserve">"2017-09-01"</w:t>
+      </w:r>
+      <w:r>
+        <w:rPr>
+          <w:rStyle w:val="NormalTok"/>
+        </w:rPr>
+        <w:t xml:space="preserve">,</w:t>
+      </w:r>
+      <w:r>
+        <w:rPr>
+          <w:rStyle w:val="StringTok"/>
+        </w:rPr>
+        <w:t xml:space="preserve">"2018-09-01"</w:t>
+      </w:r>
+      <w:r>
+        <w:rPr>
+          <w:rStyle w:val="NormalTok"/>
+        </w:rPr>
+        <w:t xml:space="preserve">,</w:t>
+      </w:r>
+      <w:r>
+        <w:rPr>
+          <w:rStyle w:val="StringTok"/>
+        </w:rPr>
+        <w:t xml:space="preserve">"2019-09-01"</w:t>
+      </w:r>
+      <w:r>
+        <w:rPr>
+          <w:rStyle w:val="NormalTok"/>
+        </w:rPr>
+        <w:t xml:space="preserve">,</w:t>
+      </w:r>
+      <w:r>
+        <w:rPr>
+          <w:rStyle w:val="StringTok"/>
+        </w:rPr>
+        <w:t xml:space="preserve">"2020-09-01"</w:t>
+      </w:r>
+      <w:r>
+        <w:rPr>
+          <w:rStyle w:val="NormalTok"/>
+        </w:rPr>
+        <w:t xml:space="preserve">,</w:t>
+      </w:r>
+      <w:r>
+        <w:rPr>
+          <w:rStyle w:val="StringTok"/>
+        </w:rPr>
+        <w:t xml:space="preserve">"2021-09-01"</w:t>
+      </w:r>
+      <w:r>
+        <w:rPr>
+          <w:rStyle w:val="NormalTok"/>
+        </w:rPr>
+        <w:t xml:space="preserve">,</w:t>
+      </w:r>
+      <w:r>
+        <w:br/>
+      </w:r>
+      <w:r>
+        <w:rPr>
+          <w:rStyle w:val="NormalTok"/>
+        </w:rPr>
+        <w:t xml:space="preserve">                      </w:t>
+      </w:r>
+      <w:r>
+        <w:rPr>
+          <w:rStyle w:val="StringTok"/>
+        </w:rPr>
+        <w:t xml:space="preserve">"2022-09-01"</w:t>
+      </w:r>
+      <w:r>
+        <w:rPr>
+          <w:rStyle w:val="NormalTok"/>
+        </w:rPr>
+        <w:t xml:space="preserve">,</w:t>
+      </w:r>
+      <w:r>
+        <w:rPr>
+          <w:rStyle w:val="StringTok"/>
+        </w:rPr>
+        <w:t xml:space="preserve">"2023-09-01"</w:t>
+      </w:r>
+      <w:r>
+        <w:rPr>
+          <w:rStyle w:val="NormalTok"/>
+        </w:rPr>
+        <w:t xml:space="preserve">,</w:t>
+      </w:r>
+      <w:r>
+        <w:rPr>
+          <w:rStyle w:val="StringTok"/>
+        </w:rPr>
+        <w:t xml:space="preserve">"2024-09-01"</w:t>
+      </w:r>
+      <w:r>
+        <w:rPr>
+          <w:rStyle w:val="NormalTok"/>
+        </w:rPr>
+        <w:t xml:space="preserve">))</w:t>
+      </w:r>
+      <w:r>
+        <w:br/>
+      </w:r>
+      <w:r>
+        <w:rPr>
+          <w:rStyle w:val="NormalTok"/>
+        </w:rPr>
+        <w:t xml:space="preserve">survey_years </w:t>
+      </w:r>
+      <w:r>
+        <w:rPr>
+          <w:rStyle w:val="OtherTok"/>
+        </w:rPr>
+        <w:t xml:space="preserve">&lt;-</w:t>
+      </w:r>
+      <w:r>
+        <w:rPr>
+          <w:rStyle w:val="NormalTok"/>
+        </w:rPr>
+        <w:t xml:space="preserve"> </w:t>
+      </w:r>
+      <w:r>
+        <w:rPr>
+          <w:rStyle w:val="FunctionTok"/>
+        </w:rPr>
+        <w:t xml:space="preserve">c</w:t>
+      </w:r>
+      <w:r>
+        <w:rPr>
+          <w:rStyle w:val="NormalTok"/>
+        </w:rPr>
+        <w:t xml:space="preserve">(</w:t>
+      </w:r>
+      <w:r>
+        <w:rPr>
+          <w:rStyle w:val="StringTok"/>
+        </w:rPr>
+        <w:t xml:space="preserve">"2017-2018"</w:t>
+      </w:r>
+      <w:r>
+        <w:rPr>
+          <w:rStyle w:val="NormalTok"/>
+        </w:rPr>
+        <w:t xml:space="preserve">,</w:t>
+      </w:r>
+      <w:r>
+        <w:rPr>
+          <w:rStyle w:val="StringTok"/>
+        </w:rPr>
+        <w:t xml:space="preserve">"2018-2019"</w:t>
+      </w:r>
+      <w:r>
+        <w:rPr>
+          <w:rStyle w:val="NormalTok"/>
+        </w:rPr>
+        <w:t xml:space="preserve">,</w:t>
+      </w:r>
+      <w:r>
+        <w:rPr>
+          <w:rStyle w:val="StringTok"/>
+        </w:rPr>
+        <w:t xml:space="preserve">"2019-2020"</w:t>
+      </w:r>
+      <w:r>
+        <w:rPr>
+          <w:rStyle w:val="NormalTok"/>
+        </w:rPr>
+        <w:t xml:space="preserve">,</w:t>
+      </w:r>
+      <w:r>
+        <w:rPr>
+          <w:rStyle w:val="StringTok"/>
+        </w:rPr>
+        <w:t xml:space="preserve">"2020-2021"</w:t>
+      </w:r>
+      <w:r>
+        <w:rPr>
+          <w:rStyle w:val="NormalTok"/>
+        </w:rPr>
+        <w:t xml:space="preserve">,</w:t>
+      </w:r>
+      <w:r>
+        <w:rPr>
+          <w:rStyle w:val="StringTok"/>
+        </w:rPr>
+        <w:t xml:space="preserve">"2021-2022"</w:t>
+      </w:r>
+      <w:r>
+        <w:rPr>
+          <w:rStyle w:val="NormalTok"/>
+        </w:rPr>
+        <w:t xml:space="preserve">,</w:t>
+      </w:r>
+      <w:r>
+        <w:rPr>
+          <w:rStyle w:val="StringTok"/>
+        </w:rPr>
+        <w:t xml:space="preserve">"2022-2023"</w:t>
+      </w:r>
+      <w:r>
+        <w:rPr>
+          <w:rStyle w:val="NormalTok"/>
+        </w:rPr>
+        <w:t xml:space="preserve">)</w:t>
+      </w:r>
+      <w:r>
+        <w:br/>
+      </w:r>
+      <w:r>
+        <w:rPr>
+          <w:rStyle w:val="ControlFlowTok"/>
+        </w:rPr>
+        <w:t xml:space="preserve">for</w:t>
+      </w:r>
+      <w:r>
+        <w:rPr>
+          <w:rStyle w:val="NormalTok"/>
+        </w:rPr>
+        <w:t xml:space="preserve"> (i </w:t>
+      </w:r>
+      <w:r>
+        <w:rPr>
+          <w:rStyle w:val="ControlFlowTok"/>
+        </w:rPr>
+        <w:t xml:space="preserve">in</w:t>
+      </w:r>
+      <w:r>
+        <w:rPr>
+          <w:rStyle w:val="NormalTok"/>
+        </w:rPr>
+        <w:t xml:space="preserve"> </w:t>
+      </w:r>
+      <w:r>
+        <w:rPr>
+          <w:rStyle w:val="DecValTok"/>
+        </w:rPr>
+        <w:t xml:space="preserve">1</w:t>
+      </w:r>
+      <w:r>
+        <w:rPr>
+          <w:rStyle w:val="SpecialCharTok"/>
+        </w:rPr>
+        <w:t xml:space="preserve">:</w:t>
+      </w:r>
+      <w:r>
+        <w:rPr>
+          <w:rStyle w:val="FunctionTok"/>
+        </w:rPr>
+        <w:t xml:space="preserve">nrow</w:t>
+      </w:r>
+      <w:r>
+        <w:rPr>
+          <w:rStyle w:val="NormalTok"/>
+        </w:rPr>
+        <w:t xml:space="preserve">(birdsurveys_filtered)){</w:t>
+      </w:r>
+      <w:r>
+        <w:br/>
+      </w:r>
+      <w:r>
+        <w:rPr>
+          <w:rStyle w:val="NormalTok"/>
+        </w:rPr>
+        <w:t xml:space="preserve">  </w:t>
+      </w:r>
+      <w:r>
+        <w:rPr>
+          <w:rStyle w:val="ControlFlowTok"/>
+        </w:rPr>
+        <w:t xml:space="preserve">for</w:t>
+      </w:r>
+      <w:r>
+        <w:rPr>
+          <w:rStyle w:val="NormalTok"/>
+        </w:rPr>
+        <w:t xml:space="preserve"> (j </w:t>
+      </w:r>
+      <w:r>
+        <w:rPr>
+          <w:rStyle w:val="ControlFlowTok"/>
+        </w:rPr>
+        <w:t xml:space="preserve">in</w:t>
+      </w:r>
+      <w:r>
+        <w:rPr>
+          <w:rStyle w:val="NormalTok"/>
+        </w:rPr>
+        <w:t xml:space="preserve"> </w:t>
+      </w:r>
+      <w:r>
+        <w:rPr>
+          <w:rStyle w:val="DecValTok"/>
+        </w:rPr>
+        <w:t xml:space="preserve">1</w:t>
+      </w:r>
+      <w:r>
+        <w:rPr>
+          <w:rStyle w:val="SpecialCharTok"/>
+        </w:rPr>
+        <w:t xml:space="preserve">:</w:t>
+      </w:r>
+      <w:r>
+        <w:rPr>
+          <w:rStyle w:val="FunctionTok"/>
+        </w:rPr>
+        <w:t xml:space="preserve">length</w:t>
+      </w:r>
+      <w:r>
+        <w:rPr>
+          <w:rStyle w:val="NormalTok"/>
+        </w:rPr>
+        <w:t xml:space="preserve">(</w:t>
+      </w:r>
+      <w:r>
+        <w:rPr>
+          <w:rStyle w:val="FunctionTok"/>
+        </w:rPr>
+        <w:t xml:space="preserve">unique</w:t>
+      </w:r>
+      <w:r>
+        <w:rPr>
+          <w:rStyle w:val="NormalTok"/>
+        </w:rPr>
+        <w:t xml:space="preserve">(birdsurveys_filtered</w:t>
+      </w:r>
+      <w:r>
+        <w:rPr>
+          <w:rStyle w:val="SpecialCharTok"/>
+        </w:rPr>
+        <w:t xml:space="preserve">$</w:t>
+      </w:r>
+      <w:r>
+        <w:rPr>
+          <w:rStyle w:val="NormalTok"/>
+        </w:rPr>
+        <w:t xml:space="preserve">Year))){</w:t>
+      </w:r>
+      <w:r>
+        <w:br/>
+      </w:r>
+      <w:r>
+        <w:rPr>
+          <w:rStyle w:val="NormalTok"/>
+        </w:rPr>
+        <w:t xml:space="preserve">    </w:t>
+      </w:r>
+      <w:r>
+        <w:rPr>
+          <w:rStyle w:val="ControlFlowTok"/>
+        </w:rPr>
+        <w:t xml:space="preserve">if</w:t>
+      </w:r>
+      <w:r>
+        <w:rPr>
+          <w:rStyle w:val="NormalTok"/>
+        </w:rPr>
+        <w:t xml:space="preserve"> (birdsurveys_filtered</w:t>
+      </w:r>
+      <w:r>
+        <w:rPr>
+          <w:rStyle w:val="SpecialCharTok"/>
+        </w:rPr>
+        <w:t xml:space="preserve">$</w:t>
+      </w:r>
+      <w:r>
+        <w:rPr>
+          <w:rStyle w:val="NormalTok"/>
+        </w:rPr>
+        <w:t xml:space="preserve">obs_date3[i] </w:t>
+      </w:r>
+      <w:r>
+        <w:rPr>
+          <w:rStyle w:val="SpecialCharTok"/>
+        </w:rPr>
+        <w:t xml:space="preserve">&gt;=</w:t>
+      </w:r>
+      <w:r>
+        <w:rPr>
+          <w:rStyle w:val="NormalTok"/>
+        </w:rPr>
+        <w:t xml:space="preserve"> date_borders[j] </w:t>
+      </w:r>
+      <w:r>
+        <w:rPr>
+          <w:rStyle w:val="SpecialCharTok"/>
+        </w:rPr>
+        <w:t xml:space="preserve">&amp;</w:t>
+      </w:r>
+      <w:r>
+        <w:rPr>
+          <w:rStyle w:val="NormalTok"/>
+        </w:rPr>
+        <w:t xml:space="preserve"> </w:t>
+      </w:r>
+      <w:r>
+        <w:br/>
+      </w:r>
+      <w:r>
+        <w:rPr>
+          <w:rStyle w:val="NormalTok"/>
+        </w:rPr>
+        <w:t xml:space="preserve">       birdsurveys_filtered</w:t>
+      </w:r>
+      <w:r>
+        <w:rPr>
+          <w:rStyle w:val="SpecialCharTok"/>
+        </w:rPr>
+        <w:t xml:space="preserve">$</w:t>
+      </w:r>
+      <w:r>
+        <w:rPr>
+          <w:rStyle w:val="NormalTok"/>
+        </w:rPr>
+        <w:t xml:space="preserve">obs_date3[i] </w:t>
+      </w:r>
+      <w:r>
+        <w:rPr>
+          <w:rStyle w:val="SpecialCharTok"/>
+        </w:rPr>
+        <w:t xml:space="preserve">&lt;</w:t>
+      </w:r>
+      <w:r>
+        <w:rPr>
+          <w:rStyle w:val="NormalTok"/>
+        </w:rPr>
+        <w:t xml:space="preserve"> date_borders[j </w:t>
+      </w:r>
+      <w:r>
+        <w:rPr>
+          <w:rStyle w:val="SpecialCharTok"/>
+        </w:rPr>
+        <w:t xml:space="preserve">+</w:t>
+      </w:r>
+      <w:r>
+        <w:rPr>
+          <w:rStyle w:val="NormalTok"/>
+        </w:rPr>
+        <w:t xml:space="preserve"> </w:t>
+      </w:r>
+      <w:r>
+        <w:rPr>
+          <w:rStyle w:val="DecValTok"/>
+        </w:rPr>
+        <w:t xml:space="preserve">1</w:t>
+      </w:r>
+      <w:r>
+        <w:rPr>
+          <w:rStyle w:val="NormalTok"/>
+        </w:rPr>
+        <w:t xml:space="preserve">]){</w:t>
+      </w:r>
+      <w:r>
+        <w:br/>
+      </w:r>
+      <w:r>
+        <w:rPr>
+          <w:rStyle w:val="NormalTok"/>
+        </w:rPr>
+        <w:t xml:space="preserve">      birdsurveys_filtered</w:t>
+      </w:r>
+      <w:r>
+        <w:rPr>
+          <w:rStyle w:val="SpecialCharTok"/>
+        </w:rPr>
+        <w:t xml:space="preserve">$</w:t>
+      </w:r>
+      <w:r>
+        <w:rPr>
+          <w:rStyle w:val="NormalTok"/>
+        </w:rPr>
+        <w:t xml:space="preserve">survey_year[i] </w:t>
+      </w:r>
+      <w:r>
+        <w:rPr>
+          <w:rStyle w:val="OtherTok"/>
+        </w:rPr>
+        <w:t xml:space="preserve">=</w:t>
+      </w:r>
+      <w:r>
+        <w:rPr>
+          <w:rStyle w:val="NormalTok"/>
+        </w:rPr>
+        <w:t xml:space="preserve"> survey_years[j]</w:t>
+      </w:r>
+      <w:r>
+        <w:br/>
+      </w:r>
+      <w:r>
+        <w:rPr>
+          <w:rStyle w:val="NormalTok"/>
+        </w:rPr>
+        <w:t xml:space="preserve">    }</w:t>
+      </w:r>
+      <w:r>
+        <w:br/>
+      </w:r>
+      <w:r>
+        <w:rPr>
+          <w:rStyle w:val="NormalTok"/>
+        </w:rPr>
+        <w:t xml:space="preserve">  }</w:t>
+      </w:r>
+      <w:r>
+        <w:br/>
+      </w:r>
+      <w:r>
+        <w:rPr>
+          <w:rStyle w:val="NormalTok"/>
+        </w:rPr>
+        <w:t xml:space="preserve">}</w:t>
+      </w:r>
+      <w:r>
+        <w:br/>
+      </w:r>
+      <w:r>
+        <w:br/>
+      </w:r>
+      <w:r>
+        <w:rPr>
+          <w:rStyle w:val="CommentTok"/>
+        </w:rPr>
+        <w:t xml:space="preserve"># creating variable for season of date</w:t>
+      </w:r>
+      <w:r>
+        <w:br/>
+      </w:r>
+      <w:r>
+        <w:rPr>
+          <w:rStyle w:val="NormalTok"/>
+        </w:rPr>
+        <w:t xml:space="preserve">winter </w:t>
+      </w:r>
+      <w:r>
+        <w:rPr>
+          <w:rStyle w:val="OtherTok"/>
+        </w:rPr>
+        <w:t xml:space="preserve">=</w:t>
+      </w:r>
+      <w:r>
+        <w:rPr>
+          <w:rStyle w:val="NormalTok"/>
+        </w:rPr>
+        <w:t xml:space="preserve"> </w:t>
+      </w:r>
+      <w:r>
+        <w:rPr>
+          <w:rStyle w:val="FunctionTok"/>
+        </w:rPr>
+        <w:t xml:space="preserve">list</w:t>
+      </w:r>
+      <w:r>
+        <w:rPr>
+          <w:rStyle w:val="NormalTok"/>
+        </w:rPr>
+        <w:t xml:space="preserve">(</w:t>
+      </w:r>
+      <w:r>
+        <w:rPr>
+          <w:rStyle w:val="FunctionTok"/>
+        </w:rPr>
+        <w:t xml:space="preserve">c</w:t>
+      </w:r>
+      <w:r>
+        <w:rPr>
+          <w:rStyle w:val="NormalTok"/>
+        </w:rPr>
+        <w:t xml:space="preserve">(</w:t>
+      </w:r>
+      <w:r>
+        <w:rPr>
+          <w:rStyle w:val="DecValTok"/>
+        </w:rPr>
+        <w:t xml:space="preserve">1</w:t>
+      </w:r>
+      <w:r>
+        <w:rPr>
+          <w:rStyle w:val="NormalTok"/>
+        </w:rPr>
+        <w:t xml:space="preserve">,</w:t>
+      </w:r>
+      <w:r>
+        <w:rPr>
+          <w:rStyle w:val="DecValTok"/>
+        </w:rPr>
+        <w:t xml:space="preserve">2</w:t>
+      </w:r>
+      <w:r>
+        <w:rPr>
+          <w:rStyle w:val="NormalTok"/>
+        </w:rPr>
+        <w:t xml:space="preserve">,</w:t>
+      </w:r>
+      <w:r>
+        <w:rPr>
+          <w:rStyle w:val="DecValTok"/>
+        </w:rPr>
+        <w:t xml:space="preserve">12</w:t>
+      </w:r>
+      <w:r>
+        <w:rPr>
+          <w:rStyle w:val="NormalTok"/>
+        </w:rPr>
+        <w:t xml:space="preserve">))</w:t>
+      </w:r>
+      <w:r>
+        <w:br/>
+      </w:r>
+      <w:r>
+        <w:rPr>
+          <w:rStyle w:val="NormalTok"/>
+        </w:rPr>
+        <w:t xml:space="preserve">spring </w:t>
+      </w:r>
+      <w:r>
+        <w:rPr>
+          <w:rStyle w:val="OtherTok"/>
+        </w:rPr>
+        <w:t xml:space="preserve">=</w:t>
+      </w:r>
+      <w:r>
+        <w:rPr>
+          <w:rStyle w:val="NormalTok"/>
+        </w:rPr>
+        <w:t xml:space="preserve"> </w:t>
+      </w:r>
+      <w:r>
+        <w:rPr>
+          <w:rStyle w:val="FunctionTok"/>
+        </w:rPr>
+        <w:t xml:space="preserve">list</w:t>
+      </w:r>
+      <w:r>
+        <w:rPr>
+          <w:rStyle w:val="NormalTok"/>
+        </w:rPr>
+        <w:t xml:space="preserve">(</w:t>
+      </w:r>
+      <w:r>
+        <w:rPr>
+          <w:rStyle w:val="FunctionTok"/>
+        </w:rPr>
+        <w:t xml:space="preserve">c</w:t>
+      </w:r>
+      <w:r>
+        <w:rPr>
+          <w:rStyle w:val="NormalTok"/>
+        </w:rPr>
+        <w:t xml:space="preserve">(</w:t>
+      </w:r>
+      <w:r>
+        <w:rPr>
+          <w:rStyle w:val="DecValTok"/>
+        </w:rPr>
+        <w:t xml:space="preserve">3</w:t>
+      </w:r>
+      <w:r>
+        <w:rPr>
+          <w:rStyle w:val="SpecialCharTok"/>
+        </w:rPr>
+        <w:t xml:space="preserve">:</w:t>
+      </w:r>
+      <w:r>
+        <w:rPr>
+          <w:rStyle w:val="DecValTok"/>
+        </w:rPr>
+        <w:t xml:space="preserve">5</w:t>
+      </w:r>
+      <w:r>
+        <w:rPr>
+          <w:rStyle w:val="NormalTok"/>
+        </w:rPr>
+        <w:t xml:space="preserve">))</w:t>
+      </w:r>
+      <w:r>
+        <w:br/>
+      </w:r>
+      <w:r>
+        <w:rPr>
+          <w:rStyle w:val="NormalTok"/>
+        </w:rPr>
+        <w:t xml:space="preserve">summer </w:t>
+      </w:r>
+      <w:r>
+        <w:rPr>
+          <w:rStyle w:val="OtherTok"/>
+        </w:rPr>
+        <w:t xml:space="preserve">=</w:t>
+      </w:r>
+      <w:r>
+        <w:rPr>
+          <w:rStyle w:val="NormalTok"/>
+        </w:rPr>
+        <w:t xml:space="preserve"> </w:t>
+      </w:r>
+      <w:r>
+        <w:rPr>
+          <w:rStyle w:val="FunctionTok"/>
+        </w:rPr>
+        <w:t xml:space="preserve">list</w:t>
+      </w:r>
+      <w:r>
+        <w:rPr>
+          <w:rStyle w:val="NormalTok"/>
+        </w:rPr>
+        <w:t xml:space="preserve">(</w:t>
+      </w:r>
+      <w:r>
+        <w:rPr>
+          <w:rStyle w:val="FunctionTok"/>
+        </w:rPr>
+        <w:t xml:space="preserve">c</w:t>
+      </w:r>
+      <w:r>
+        <w:rPr>
+          <w:rStyle w:val="NormalTok"/>
+        </w:rPr>
+        <w:t xml:space="preserve">(</w:t>
+      </w:r>
+      <w:r>
+        <w:rPr>
+          <w:rStyle w:val="DecValTok"/>
+        </w:rPr>
+        <w:t xml:space="preserve">6</w:t>
+      </w:r>
+      <w:r>
+        <w:rPr>
+          <w:rStyle w:val="SpecialCharTok"/>
+        </w:rPr>
+        <w:t xml:space="preserve">:</w:t>
+      </w:r>
+      <w:r>
+        <w:rPr>
+          <w:rStyle w:val="DecValTok"/>
+        </w:rPr>
+        <w:t xml:space="preserve">8</w:t>
+      </w:r>
+      <w:r>
+        <w:rPr>
+          <w:rStyle w:val="NormalTok"/>
+        </w:rPr>
+        <w:t xml:space="preserve">))</w:t>
+      </w:r>
+      <w:r>
+        <w:br/>
+      </w:r>
+      <w:r>
+        <w:rPr>
+          <w:rStyle w:val="NormalTok"/>
+        </w:rPr>
+        <w:t xml:space="preserve">fall </w:t>
+      </w:r>
+      <w:r>
+        <w:rPr>
+          <w:rStyle w:val="OtherTok"/>
+        </w:rPr>
+        <w:t xml:space="preserve">=</w:t>
+      </w:r>
+      <w:r>
+        <w:rPr>
+          <w:rStyle w:val="NormalTok"/>
+        </w:rPr>
+        <w:t xml:space="preserve"> </w:t>
+      </w:r>
+      <w:r>
+        <w:rPr>
+          <w:rStyle w:val="FunctionTok"/>
+        </w:rPr>
+        <w:t xml:space="preserve">list</w:t>
+      </w:r>
+      <w:r>
+        <w:rPr>
+          <w:rStyle w:val="NormalTok"/>
+        </w:rPr>
+        <w:t xml:space="preserve">(</w:t>
+      </w:r>
+      <w:r>
+        <w:rPr>
+          <w:rStyle w:val="FunctionTok"/>
+        </w:rPr>
+        <w:t xml:space="preserve">c</w:t>
+      </w:r>
+      <w:r>
+        <w:rPr>
+          <w:rStyle w:val="NormalTok"/>
+        </w:rPr>
+        <w:t xml:space="preserve">(</w:t>
+      </w:r>
+      <w:r>
+        <w:rPr>
+          <w:rStyle w:val="DecValTok"/>
+        </w:rPr>
+        <w:t xml:space="preserve">9</w:t>
+      </w:r>
+      <w:r>
+        <w:rPr>
+          <w:rStyle w:val="SpecialCharTok"/>
+        </w:rPr>
+        <w:t xml:space="preserve">:</w:t>
+      </w:r>
+      <w:r>
+        <w:rPr>
+          <w:rStyle w:val="DecValTok"/>
+        </w:rPr>
+        <w:t xml:space="preserve">11</w:t>
+      </w:r>
+      <w:r>
+        <w:rPr>
+          <w:rStyle w:val="NormalTok"/>
+        </w:rPr>
+        <w:t xml:space="preserve">))</w:t>
+      </w:r>
+      <w:r>
+        <w:br/>
+      </w:r>
+      <w:r>
+        <w:rPr>
+          <w:rStyle w:val="NormalTok"/>
+        </w:rPr>
+        <w:t xml:space="preserve">season_borders </w:t>
+      </w:r>
+      <w:r>
+        <w:rPr>
+          <w:rStyle w:val="OtherTok"/>
+        </w:rPr>
+        <w:t xml:space="preserve">=</w:t>
+      </w:r>
+      <w:r>
+        <w:rPr>
+          <w:rStyle w:val="NormalTok"/>
+        </w:rPr>
+        <w:t xml:space="preserve"> </w:t>
+      </w:r>
+      <w:r>
+        <w:rPr>
+          <w:rStyle w:val="FunctionTok"/>
+        </w:rPr>
+        <w:t xml:space="preserve">c</w:t>
+      </w:r>
+      <w:r>
+        <w:rPr>
+          <w:rStyle w:val="NormalTok"/>
+        </w:rPr>
+        <w:t xml:space="preserve">(winter,spring,summer,fall)</w:t>
+      </w:r>
+      <w:r>
+        <w:br/>
+      </w:r>
+      <w:r>
+        <w:rPr>
+          <w:rStyle w:val="NormalTok"/>
+        </w:rPr>
+        <w:t xml:space="preserve">seasons </w:t>
+      </w:r>
+      <w:r>
+        <w:rPr>
+          <w:rStyle w:val="OtherTok"/>
+        </w:rPr>
+        <w:t xml:space="preserve">&lt;-</w:t>
+      </w:r>
+      <w:r>
+        <w:rPr>
+          <w:rStyle w:val="NormalTok"/>
+        </w:rPr>
+        <w:t xml:space="preserve"> </w:t>
+      </w:r>
+      <w:r>
+        <w:rPr>
+          <w:rStyle w:val="FunctionTok"/>
+        </w:rPr>
+        <w:t xml:space="preserve">c</w:t>
+      </w:r>
+      <w:r>
+        <w:rPr>
+          <w:rStyle w:val="NormalTok"/>
+        </w:rPr>
+        <w:t xml:space="preserve">(</w:t>
+      </w:r>
+      <w:r>
+        <w:rPr>
+          <w:rStyle w:val="StringTok"/>
+        </w:rPr>
+        <w:t xml:space="preserve">"Winter"</w:t>
+      </w:r>
+      <w:r>
+        <w:rPr>
+          <w:rStyle w:val="NormalTok"/>
+        </w:rPr>
+        <w:t xml:space="preserve">,</w:t>
+      </w:r>
+      <w:r>
+        <w:rPr>
+          <w:rStyle w:val="StringTok"/>
+        </w:rPr>
+        <w:t xml:space="preserve">"Spring"</w:t>
+      </w:r>
+      <w:r>
+        <w:rPr>
+          <w:rStyle w:val="NormalTok"/>
+        </w:rPr>
+        <w:t xml:space="preserve">,</w:t>
+      </w:r>
+      <w:r>
+        <w:rPr>
+          <w:rStyle w:val="StringTok"/>
+        </w:rPr>
+        <w:t xml:space="preserve">"Summer"</w:t>
+      </w:r>
+      <w:r>
+        <w:rPr>
+          <w:rStyle w:val="NormalTok"/>
+        </w:rPr>
+        <w:t xml:space="preserve">,</w:t>
+      </w:r>
+      <w:r>
+        <w:rPr>
+          <w:rStyle w:val="StringTok"/>
+        </w:rPr>
+        <w:t xml:space="preserve">"Fall"</w:t>
+      </w:r>
+      <w:r>
+        <w:rPr>
+          <w:rStyle w:val="NormalTok"/>
+        </w:rPr>
+        <w:t xml:space="preserve">)</w:t>
+      </w:r>
+      <w:r>
+        <w:br/>
+      </w:r>
+      <w:r>
+        <w:rPr>
+          <w:rStyle w:val="ControlFlowTok"/>
+        </w:rPr>
+        <w:t xml:space="preserve">for</w:t>
+      </w:r>
+      <w:r>
+        <w:rPr>
+          <w:rStyle w:val="NormalTok"/>
+        </w:rPr>
+        <w:t xml:space="preserve"> (i </w:t>
+      </w:r>
+      <w:r>
+        <w:rPr>
+          <w:rStyle w:val="ControlFlowTok"/>
+        </w:rPr>
+        <w:t xml:space="preserve">in</w:t>
+      </w:r>
+      <w:r>
+        <w:rPr>
+          <w:rStyle w:val="NormalTok"/>
+        </w:rPr>
+        <w:t xml:space="preserve"> </w:t>
+      </w:r>
+      <w:r>
+        <w:rPr>
+          <w:rStyle w:val="DecValTok"/>
+        </w:rPr>
+        <w:t xml:space="preserve">1</w:t>
+      </w:r>
+      <w:r>
+        <w:rPr>
+          <w:rStyle w:val="SpecialCharTok"/>
+        </w:rPr>
+        <w:t xml:space="preserve">:</w:t>
+      </w:r>
+      <w:r>
+        <w:rPr>
+          <w:rStyle w:val="FunctionTok"/>
+        </w:rPr>
+        <w:t xml:space="preserve">nrow</w:t>
+      </w:r>
+      <w:r>
+        <w:rPr>
+          <w:rStyle w:val="NormalTok"/>
+        </w:rPr>
+        <w:t xml:space="preserve">(birdsurveys_filtered)){</w:t>
+      </w:r>
+      <w:r>
+        <w:br/>
+      </w:r>
+      <w:r>
+        <w:rPr>
+          <w:rStyle w:val="NormalTok"/>
+        </w:rPr>
+        <w:t xml:space="preserve">  </w:t>
+      </w:r>
+      <w:r>
+        <w:rPr>
+          <w:rStyle w:val="ControlFlowTok"/>
+        </w:rPr>
+        <w:t xml:space="preserve">for</w:t>
+      </w:r>
+      <w:r>
+        <w:rPr>
+          <w:rStyle w:val="NormalTok"/>
+        </w:rPr>
+        <w:t xml:space="preserve"> (j </w:t>
+      </w:r>
+      <w:r>
+        <w:rPr>
+          <w:rStyle w:val="ControlFlowTok"/>
+        </w:rPr>
+        <w:t xml:space="preserve">in</w:t>
+      </w:r>
+      <w:r>
+        <w:rPr>
+          <w:rStyle w:val="NormalTok"/>
+        </w:rPr>
+        <w:t xml:space="preserve"> </w:t>
+      </w:r>
+      <w:r>
+        <w:rPr>
+          <w:rStyle w:val="DecValTok"/>
+        </w:rPr>
+        <w:t xml:space="preserve">1</w:t>
+      </w:r>
+      <w:r>
+        <w:rPr>
+          <w:rStyle w:val="SpecialCharTok"/>
+        </w:rPr>
+        <w:t xml:space="preserve">:</w:t>
+      </w:r>
+      <w:r>
+        <w:rPr>
+          <w:rStyle w:val="FunctionTok"/>
+        </w:rPr>
+        <w:t xml:space="preserve">length</w:t>
+      </w:r>
+      <w:r>
+        <w:rPr>
+          <w:rStyle w:val="NormalTok"/>
+        </w:rPr>
+        <w:t xml:space="preserve">(season_borders)){</w:t>
+      </w:r>
+      <w:r>
+        <w:br/>
+      </w:r>
+      <w:r>
+        <w:rPr>
+          <w:rStyle w:val="NormalTok"/>
+        </w:rPr>
+        <w:t xml:space="preserve">    </w:t>
+      </w:r>
+      <w:r>
+        <w:rPr>
+          <w:rStyle w:val="ControlFlowTok"/>
+        </w:rPr>
+        <w:t xml:space="preserve">if</w:t>
+      </w:r>
+      <w:r>
+        <w:rPr>
+          <w:rStyle w:val="NormalTok"/>
+        </w:rPr>
+        <w:t xml:space="preserve"> (</w:t>
+      </w:r>
+      <w:r>
+        <w:rPr>
+          <w:rStyle w:val="FunctionTok"/>
+        </w:rPr>
+        <w:t xml:space="preserve">month</w:t>
+      </w:r>
+      <w:r>
+        <w:rPr>
+          <w:rStyle w:val="NormalTok"/>
+        </w:rPr>
+        <w:t xml:space="preserve">(birdsurveys_filtered</w:t>
+      </w:r>
+      <w:r>
+        <w:rPr>
+          <w:rStyle w:val="SpecialCharTok"/>
+        </w:rPr>
+        <w:t xml:space="preserve">$</w:t>
+      </w:r>
+      <w:r>
+        <w:rPr>
+          <w:rStyle w:val="NormalTok"/>
+        </w:rPr>
+        <w:t xml:space="preserve">obs_date3[i]) </w:t>
+      </w:r>
+      <w:r>
+        <w:rPr>
+          <w:rStyle w:val="SpecialCharTok"/>
+        </w:rPr>
+        <w:t xml:space="preserve">%in%</w:t>
+      </w:r>
+      <w:r>
+        <w:rPr>
+          <w:rStyle w:val="NormalTok"/>
+        </w:rPr>
+        <w:t xml:space="preserve"> season_borders[[j]]){</w:t>
+      </w:r>
+      <w:r>
+        <w:br/>
+      </w:r>
+      <w:r>
+        <w:rPr>
+          <w:rStyle w:val="NormalTok"/>
+        </w:rPr>
+        <w:t xml:space="preserve">      birdsurveys_filtered</w:t>
+      </w:r>
+      <w:r>
+        <w:rPr>
+          <w:rStyle w:val="SpecialCharTok"/>
+        </w:rPr>
+        <w:t xml:space="preserve">$</w:t>
+      </w:r>
+      <w:r>
+        <w:rPr>
+          <w:rStyle w:val="NormalTok"/>
+        </w:rPr>
+        <w:t xml:space="preserve">season[i] </w:t>
+      </w:r>
+      <w:r>
+        <w:rPr>
+          <w:rStyle w:val="OtherTok"/>
+        </w:rPr>
+        <w:t xml:space="preserve">=</w:t>
+      </w:r>
+      <w:r>
+        <w:rPr>
+          <w:rStyle w:val="NormalTok"/>
+        </w:rPr>
+        <w:t xml:space="preserve"> seasons[j]</w:t>
+      </w:r>
+      <w:r>
+        <w:br/>
+      </w:r>
+      <w:r>
+        <w:rPr>
+          <w:rStyle w:val="NormalTok"/>
+        </w:rPr>
+        <w:t xml:space="preserve">    }</w:t>
+      </w:r>
+      <w:r>
+        <w:br/>
+      </w:r>
+      <w:r>
+        <w:rPr>
+          <w:rStyle w:val="NormalTok"/>
+        </w:rPr>
+        <w:t xml:space="preserve">  }</w:t>
+      </w:r>
+      <w:r>
+        <w:br/>
+      </w:r>
+      <w:r>
+        <w:rPr>
+          <w:rStyle w:val="NormalTok"/>
+        </w:rPr>
+        <w:t xml:space="preserve">}</w:t>
+      </w:r>
+      <w:r>
+        <w:br/>
+      </w:r>
+      <w:r>
+        <w:br/>
+      </w:r>
+      <w:r>
+        <w:rPr>
+          <w:rStyle w:val="CommentTok"/>
+        </w:rPr>
+        <w:t xml:space="preserve"># joining aoc checklist with bird survey data and organizing variables</w:t>
+      </w:r>
+      <w:r>
+        <w:br/>
+      </w:r>
+      <w:r>
+        <w:rPr>
+          <w:rStyle w:val="NormalTok"/>
+        </w:rPr>
+        <w:t xml:space="preserve">joined </w:t>
+      </w:r>
+      <w:r>
+        <w:rPr>
+          <w:rStyle w:val="OtherTok"/>
+        </w:rPr>
+        <w:t xml:space="preserve">&lt;-</w:t>
+      </w:r>
+      <w:r>
+        <w:rPr>
+          <w:rStyle w:val="NormalTok"/>
+        </w:rPr>
+        <w:t xml:space="preserve"> </w:t>
+      </w:r>
+      <w:r>
+        <w:rPr>
+          <w:rStyle w:val="FunctionTok"/>
+        </w:rPr>
+        <w:t xml:space="preserve">inner_join</w:t>
+      </w:r>
+      <w:r>
+        <w:rPr>
+          <w:rStyle w:val="NormalTok"/>
+        </w:rPr>
+        <w:t xml:space="preserve">(birdsurveys_filtered,nacc_filtered,</w:t>
+      </w:r>
+      <w:r>
+        <w:rPr>
+          <w:rStyle w:val="AttributeTok"/>
+        </w:rPr>
+        <w:t xml:space="preserve">by =</w:t>
+      </w:r>
+      <w:r>
+        <w:rPr>
+          <w:rStyle w:val="NormalTok"/>
+        </w:rPr>
+        <w:t xml:space="preserve"> </w:t>
+      </w:r>
+      <w:r>
+        <w:rPr>
+          <w:rStyle w:val="FunctionTok"/>
+        </w:rPr>
+        <w:t xml:space="preserve">c</w:t>
+      </w:r>
+      <w:r>
+        <w:rPr>
+          <w:rStyle w:val="NormalTok"/>
+        </w:rPr>
+        <w:t xml:space="preserve">(</w:t>
+      </w:r>
+      <w:r>
+        <w:rPr>
+          <w:rStyle w:val="StringTok"/>
+        </w:rPr>
+        <w:t xml:space="preserve">"Species"</w:t>
+      </w:r>
+      <w:r>
+        <w:rPr>
+          <w:rStyle w:val="NormalTok"/>
+        </w:rPr>
+        <w:t xml:space="preserve"> </w:t>
+      </w:r>
+      <w:r>
+        <w:rPr>
+          <w:rStyle w:val="OtherTok"/>
+        </w:rPr>
+        <w:t xml:space="preserve">=</w:t>
+      </w:r>
+      <w:r>
+        <w:rPr>
+          <w:rStyle w:val="NormalTok"/>
+        </w:rPr>
+        <w:t xml:space="preserve"> </w:t>
+      </w:r>
+      <w:r>
+        <w:rPr>
+          <w:rStyle w:val="StringTok"/>
+        </w:rPr>
+        <w:t xml:space="preserve">"common_name"</w:t>
+      </w:r>
+      <w:r>
+        <w:rPr>
+          <w:rStyle w:val="NormalTok"/>
+        </w:rPr>
+        <w:t xml:space="preserve">))</w:t>
+      </w:r>
+      <w:r>
+        <w:br/>
+      </w:r>
+      <w:r>
+        <w:rPr>
+          <w:rStyle w:val="NormalTok"/>
+        </w:rPr>
+        <w:t xml:space="preserve">joined </w:t>
+      </w:r>
+      <w:r>
+        <w:rPr>
+          <w:rStyle w:val="OtherTok"/>
+        </w:rPr>
+        <w:t xml:space="preserve">&lt;-</w:t>
+      </w:r>
+      <w:r>
+        <w:rPr>
+          <w:rStyle w:val="NormalTok"/>
+        </w:rPr>
+        <w:t xml:space="preserve"> joined </w:t>
+      </w:r>
+      <w:r>
+        <w:rPr>
+          <w:rStyle w:val="SpecialCharTok"/>
+        </w:rPr>
+        <w:t xml:space="preserve">%&gt;%</w:t>
+      </w:r>
+      <w:r>
+        <w:rPr>
+          <w:rStyle w:val="NormalTok"/>
+        </w:rPr>
+        <w:t xml:space="preserve"> </w:t>
+      </w:r>
+      <w:r>
+        <w:rPr>
+          <w:rStyle w:val="FunctionTok"/>
+        </w:rPr>
+        <w:t xml:space="preserve">select</w:t>
+      </w:r>
+      <w:r>
+        <w:rPr>
+          <w:rStyle w:val="NormalTok"/>
+        </w:rPr>
+        <w:t xml:space="preserve">(Year,obs_date3,survey_year,season,</w:t>
+      </w:r>
+      <w:r>
+        <w:br/>
+      </w:r>
+      <w:r>
+        <w:rPr>
+          <w:rStyle w:val="NormalTok"/>
+        </w:rPr>
+        <w:t xml:space="preserve">                            </w:t>
+      </w:r>
+      <w:r>
+        <w:rPr>
+          <w:rStyle w:val="FunctionTok"/>
+        </w:rPr>
+        <w:t xml:space="preserve">everything</w:t>
+      </w:r>
+      <w:r>
+        <w:rPr>
+          <w:rStyle w:val="NormalTok"/>
+        </w:rPr>
+        <w:t xml:space="preserve">(),</w:t>
+      </w:r>
+      <w:r>
+        <w:br/>
+      </w:r>
+      <w:r>
+        <w:rPr>
+          <w:rStyle w:val="NormalTok"/>
+        </w:rPr>
+        <w:t xml:space="preserve">                            </w:t>
+      </w:r>
+      <w:r>
+        <w:rPr>
+          <w:rStyle w:val="SpecialCharTok"/>
+        </w:rPr>
+        <w:t xml:space="preserve">-</w:t>
+      </w:r>
+      <w:r>
+        <w:rPr>
+          <w:rStyle w:val="NormalTok"/>
+        </w:rPr>
+        <w:t xml:space="preserve">Observation.Date,</w:t>
+      </w:r>
+      <w:r>
+        <w:rPr>
+          <w:rStyle w:val="SpecialCharTok"/>
+        </w:rPr>
+        <w:t xml:space="preserve">-</w:t>
+      </w:r>
+      <w:r>
+        <w:rPr>
+          <w:rStyle w:val="NormalTok"/>
+        </w:rPr>
+        <w:t xml:space="preserve">obs_date2)</w:t>
+      </w:r>
+      <w:r>
+        <w:br/>
+      </w:r>
+      <w:r>
+        <w:br/>
+      </w:r>
+      <w:r>
+        <w:rPr>
+          <w:rStyle w:val="CommentTok"/>
+        </w:rPr>
+        <w:t xml:space="preserve"># 2021 hibernacula camera observations dataset</w:t>
+      </w:r>
+      <w:r>
+        <w:br/>
+      </w:r>
+      <w:r>
+        <w:rPr>
+          <w:rStyle w:val="NormalTok"/>
+        </w:rPr>
+        <w:t xml:space="preserve">hibernaculapath </w:t>
+      </w:r>
+      <w:r>
+        <w:rPr>
+          <w:rStyle w:val="OtherTok"/>
+        </w:rPr>
+        <w:t xml:space="preserve">&lt;-</w:t>
+      </w:r>
+      <w:r>
+        <w:rPr>
+          <w:rStyle w:val="NormalTok"/>
+        </w:rPr>
+        <w:t xml:space="preserve"> </w:t>
+      </w:r>
+      <w:r>
+        <w:rPr>
+          <w:rStyle w:val="FunctionTok"/>
+        </w:rPr>
+        <w:t xml:space="preserve">here</w:t>
+      </w:r>
+      <w:r>
+        <w:rPr>
+          <w:rStyle w:val="NormalTok"/>
+        </w:rPr>
+        <w:t xml:space="preserve">(</w:t>
+      </w:r>
+      <w:r>
+        <w:rPr>
+          <w:rStyle w:val="StringTok"/>
+        </w:rPr>
+        <w:t xml:space="preserve">"data"</w:t>
+      </w:r>
+      <w:r>
+        <w:rPr>
+          <w:rStyle w:val="NormalTok"/>
+        </w:rPr>
+        <w:t xml:space="preserve">,</w:t>
+      </w:r>
+      <w:r>
+        <w:rPr>
+          <w:rStyle w:val="StringTok"/>
+        </w:rPr>
+        <w:t xml:space="preserve">"hibernacula_camera_trapping_sp_list.csv"</w:t>
+      </w:r>
+      <w:r>
+        <w:rPr>
+          <w:rStyle w:val="NormalTok"/>
+        </w:rPr>
+        <w:t xml:space="preserve">)</w:t>
+      </w:r>
+      <w:r>
+        <w:br/>
+      </w:r>
+      <w:r>
+        <w:rPr>
+          <w:rStyle w:val="NormalTok"/>
+        </w:rPr>
+        <w:t xml:space="preserve">hibernacula </w:t>
+      </w:r>
+      <w:r>
+        <w:rPr>
+          <w:rStyle w:val="OtherTok"/>
+        </w:rPr>
+        <w:t xml:space="preserve">&lt;-</w:t>
+      </w:r>
+      <w:r>
+        <w:rPr>
+          <w:rStyle w:val="NormalTok"/>
+        </w:rPr>
+        <w:t xml:space="preserve"> </w:t>
+      </w:r>
+      <w:r>
+        <w:rPr>
+          <w:rStyle w:val="FunctionTok"/>
+        </w:rPr>
+        <w:t xml:space="preserve">read_csv</w:t>
+      </w:r>
+      <w:r>
+        <w:rPr>
+          <w:rStyle w:val="NormalTok"/>
+        </w:rPr>
+        <w:t xml:space="preserve">(hibernaculapath)</w:t>
+      </w:r>
+    </w:p>
+    <w:p>
+      <w:pPr>
+        <w:pStyle w:val="SourceCode"/>
+      </w:pPr>
+      <w:r>
+        <w:rPr>
+          <w:rStyle w:val="VerbatimChar"/>
+        </w:rPr>
+        <w:t xml:space="preserve">## Rows: 17 Columns: 4</w:t>
+      </w:r>
+      <w:r>
+        <w:br/>
+      </w:r>
+      <w:r>
+        <w:rPr>
+          <w:rStyle w:val="VerbatimChar"/>
+        </w:rPr>
+        <w:t xml:space="preserve">## ── Column specification ────────────────────────────────────────────────────────</w:t>
+      </w:r>
+      <w:r>
+        <w:br/>
+      </w:r>
+      <w:r>
+        <w:rPr>
+          <w:rStyle w:val="VerbatimChar"/>
+        </w:rPr>
+        <w:t xml:space="preserve">## Delimiter: ","</w:t>
+      </w:r>
+      <w:r>
+        <w:br/>
+      </w:r>
+      <w:r>
+        <w:rPr>
+          <w:rStyle w:val="VerbatimChar"/>
+        </w:rPr>
+        <w:t xml:space="preserve">## chr (2): Common Name, % Visited</w:t>
+      </w:r>
+      <w:r>
+        <w:br/>
+      </w:r>
+      <w:r>
+        <w:rPr>
+          <w:rStyle w:val="VerbatimChar"/>
+        </w:rPr>
+        <w:t xml:space="preserve">## dbl (2): Detections, Per Cam.-Day</w:t>
+      </w:r>
+      <w:r>
+        <w:br/>
+      </w:r>
+      <w:r>
+        <w:rPr>
+          <w:rStyle w:val="VerbatimChar"/>
+        </w:rPr>
+        <w:t xml:space="preserve">## </w:t>
+      </w:r>
+      <w:r>
+        <w:br/>
+      </w:r>
+      <w:r>
+        <w:rPr>
+          <w:rStyle w:val="VerbatimChar"/>
+        </w:rPr>
+        <w:t xml:space="preserve">## ℹ Use `spec()` to retrieve the full column specification for this data.</w:t>
+      </w:r>
+      <w:r>
+        <w:br/>
+      </w:r>
+      <w:r>
+        <w:rPr>
+          <w:rStyle w:val="VerbatimChar"/>
+        </w:rPr>
+        <w:t xml:space="preserve">## ℹ Specify the column types or set `show_col_types = FALSE` to quiet this message.</w:t>
+      </w:r>
+    </w:p>
+    <w:p>
+      <w:pPr>
+        <w:pStyle w:val="SourceCode"/>
+      </w:pPr>
+      <w:r>
+        <w:rPr>
+          <w:rStyle w:val="CommentTok"/>
+        </w:rPr>
         <w:t xml:space="preserve"># plot of species counts for hibernacula substrate based on most recent .csv, hibernacula_camera_trapping_sp_list.csv</w:t>
       </w:r>
       <w:r>
@@ -282,85 +3173,175 @@
         <w:rPr>
           <w:rStyle w:val="AttributeTok"/>
         </w:rPr>
+        <w:t xml:space="preserve">y =</w:t>
+      </w:r>
+      <w:r>
+        <w:rPr>
+          <w:rStyle w:val="NormalTok"/>
+        </w:rPr>
+        <w:t xml:space="preserve"> </w:t>
+      </w:r>
+      <w:r>
+        <w:rPr>
+          <w:rStyle w:val="StringTok"/>
+        </w:rPr>
+        <w:t xml:space="preserve">`</w:t>
+      </w:r>
+      <w:r>
+        <w:rPr>
+          <w:rStyle w:val="AttributeTok"/>
+        </w:rPr>
+        <w:t xml:space="preserve">Common Name</w:t>
+      </w:r>
+      <w:r>
+        <w:rPr>
+          <w:rStyle w:val="StringTok"/>
+        </w:rPr>
+        <w:t xml:space="preserve">`</w:t>
+      </w:r>
+      <w:r>
+        <w:rPr>
+          <w:rStyle w:val="NormalTok"/>
+        </w:rPr>
+        <w:t xml:space="preserve">,</w:t>
+      </w:r>
+      <w:r>
+        <w:rPr>
+          <w:rStyle w:val="AttributeTok"/>
+        </w:rPr>
         <w:t xml:space="preserve">x =</w:t>
       </w:r>
       <w:r>
         <w:rPr>
           <w:rStyle w:val="NormalTok"/>
         </w:rPr>
+        <w:t xml:space="preserve"> Detections))</w:t>
+      </w:r>
+      <w:r>
+        <w:rPr>
+          <w:rStyle w:val="SpecialCharTok"/>
+        </w:rPr>
+        <w:t xml:space="preserve">+</w:t>
+      </w:r>
+      <w:r>
+        <w:br/>
+      </w:r>
+      <w:r>
+        <w:rPr>
+          <w:rStyle w:val="NormalTok"/>
+        </w:rPr>
+        <w:t xml:space="preserve">  </w:t>
+      </w:r>
+      <w:r>
+        <w:rPr>
+          <w:rStyle w:val="FunctionTok"/>
+        </w:rPr>
+        <w:t xml:space="preserve">geom_col</w:t>
+      </w:r>
+      <w:r>
+        <w:rPr>
+          <w:rStyle w:val="NormalTok"/>
+        </w:rPr>
+        <w:t xml:space="preserve">(</w:t>
+      </w:r>
+      <w:r>
+        <w:rPr>
+          <w:rStyle w:val="AttributeTok"/>
+        </w:rPr>
+        <w:t xml:space="preserve">fill =</w:t>
+      </w:r>
+      <w:r>
+        <w:rPr>
+          <w:rStyle w:val="NormalTok"/>
+        </w:rPr>
         <w:t xml:space="preserve"> </w:t>
       </w:r>
       <w:r>
         <w:rPr>
           <w:rStyle w:val="StringTok"/>
         </w:rPr>
-        <w:t xml:space="preserve">`</w:t>
+        <w:t xml:space="preserve">"mediumpurple"</w:t>
+      </w:r>
+      <w:r>
+        <w:rPr>
+          <w:rStyle w:val="NormalTok"/>
+        </w:rPr>
+        <w:t xml:space="preserve">,</w:t>
       </w:r>
       <w:r>
         <w:rPr>
           <w:rStyle w:val="AttributeTok"/>
         </w:rPr>
-        <w:t xml:space="preserve">Common Name</w:t>
+        <w:t xml:space="preserve">alpha =</w:t>
+      </w:r>
+      <w:r>
+        <w:rPr>
+          <w:rStyle w:val="NormalTok"/>
+        </w:rPr>
+        <w:t xml:space="preserve"> </w:t>
+      </w:r>
+      <w:r>
+        <w:rPr>
+          <w:rStyle w:val="FloatTok"/>
+        </w:rPr>
+        <w:t xml:space="preserve">0.75</w:t>
+      </w:r>
+      <w:r>
+        <w:rPr>
+          <w:rStyle w:val="NormalTok"/>
+        </w:rPr>
+        <w:t xml:space="preserve">,</w:t>
+      </w:r>
+      <w:r>
+        <w:rPr>
+          <w:rStyle w:val="AttributeTok"/>
+        </w:rPr>
+        <w:t xml:space="preserve">show.legend =</w:t>
+      </w:r>
+      <w:r>
+        <w:rPr>
+          <w:rStyle w:val="NormalTok"/>
+        </w:rPr>
+        <w:t xml:space="preserve"> F)</w:t>
+      </w:r>
+      <w:r>
+        <w:rPr>
+          <w:rStyle w:val="SpecialCharTok"/>
+        </w:rPr>
+        <w:t xml:space="preserve">+</w:t>
+      </w:r>
+      <w:r>
+        <w:br/>
+      </w:r>
+      <w:r>
+        <w:rPr>
+          <w:rStyle w:val="NormalTok"/>
+        </w:rPr>
+        <w:t xml:space="preserve">  </w:t>
+      </w:r>
+      <w:r>
+        <w:rPr>
+          <w:rStyle w:val="FunctionTok"/>
+        </w:rPr>
+        <w:t xml:space="preserve">ggtitle</w:t>
+      </w:r>
+      <w:r>
+        <w:rPr>
+          <w:rStyle w:val="NormalTok"/>
+        </w:rPr>
+        <w:t xml:space="preserve">(</w:t>
       </w:r>
       <w:r>
         <w:rPr>
           <w:rStyle w:val="StringTok"/>
         </w:rPr>
-        <w:t xml:space="preserve">`</w:t>
-      </w:r>
-      <w:r>
-        <w:rPr>
-          <w:rStyle w:val="NormalTok"/>
-        </w:rPr>
-        <w:t xml:space="preserve">,</w:t>
-      </w:r>
-      <w:r>
-        <w:rPr>
-          <w:rStyle w:val="AttributeTok"/>
-        </w:rPr>
-        <w:t xml:space="preserve">y =</w:t>
-      </w:r>
-      <w:r>
-        <w:rPr>
-          <w:rStyle w:val="NormalTok"/>
-        </w:rPr>
-        <w:t xml:space="preserve"> Detections,</w:t>
-      </w:r>
-      <w:r>
-        <w:rPr>
-          <w:rStyle w:val="AttributeTok"/>
-        </w:rPr>
-        <w:t xml:space="preserve">fill =</w:t>
-      </w:r>
-      <w:r>
-        <w:rPr>
-          <w:rStyle w:val="NormalTok"/>
-        </w:rPr>
-        <w:t xml:space="preserve"> </w:t>
-      </w:r>
-      <w:r>
-        <w:rPr>
-          <w:rStyle w:val="StringTok"/>
-        </w:rPr>
-        <w:t xml:space="preserve">`</w:t>
-      </w:r>
-      <w:r>
-        <w:rPr>
-          <w:rStyle w:val="AttributeTok"/>
-        </w:rPr>
-        <w:t xml:space="preserve">Common Name</w:t>
-      </w:r>
-      <w:r>
-        <w:rPr>
-          <w:rStyle w:val="StringTok"/>
-        </w:rPr>
-        <w:t xml:space="preserve">`</w:t>
-      </w:r>
-      <w:r>
-        <w:rPr>
-          <w:rStyle w:val="NormalTok"/>
-        </w:rPr>
-        <w:t xml:space="preserve">))</w:t>
+        <w:t xml:space="preserve">"2021 Camera Trapping Hibernacula Observations"</w:t>
+      </w:r>
+      <w:r>
+        <w:rPr>
+          <w:rStyle w:val="NormalTok"/>
+        </w:rPr>
+        <w:t xml:space="preserve">)</w:t>
       </w:r>
       <w:r>
         <w:rPr>
@@ -381,268 +3362,40 @@
         <w:rPr>
           <w:rStyle w:val="FunctionTok"/>
         </w:rPr>
-        <w:t xml:space="preserve">geom_col</w:t>
+        <w:t xml:space="preserve">theme_light</w:t>
+      </w:r>
+      <w:r>
+        <w:rPr>
+          <w:rStyle w:val="NormalTok"/>
+        </w:rPr>
+        <w:t xml:space="preserve">()</w:t>
+      </w:r>
+      <w:r>
+        <w:rPr>
+          <w:rStyle w:val="SpecialCharTok"/>
+        </w:rPr>
+        <w:t xml:space="preserve">+</w:t>
+      </w:r>
+      <w:r>
+        <w:br/>
+      </w:r>
+      <w:r>
+        <w:rPr>
+          <w:rStyle w:val="NormalTok"/>
+        </w:rPr>
+        <w:t xml:space="preserve">  </w:t>
+      </w:r>
+      <w:r>
+        <w:rPr>
+          <w:rStyle w:val="FunctionTok"/>
+        </w:rPr>
+        <w:t xml:space="preserve">theme</w:t>
       </w:r>
       <w:r>
         <w:rPr>
           <w:rStyle w:val="NormalTok"/>
         </w:rPr>
         <w:t xml:space="preserve">(</w:t>
-      </w:r>
-      <w:r>
-        <w:rPr>
-          <w:rStyle w:val="AttributeTok"/>
-        </w:rPr>
-        <w:t xml:space="preserve">alpha =</w:t>
-      </w:r>
-      <w:r>
-        <w:rPr>
-          <w:rStyle w:val="NormalTok"/>
-        </w:rPr>
-        <w:t xml:space="preserve"> </w:t>
-      </w:r>
-      <w:r>
-        <w:rPr>
-          <w:rStyle w:val="FloatTok"/>
-        </w:rPr>
-        <w:t xml:space="preserve">0.9</w:t>
-      </w:r>
-      <w:r>
-        <w:rPr>
-          <w:rStyle w:val="NormalTok"/>
-        </w:rPr>
-        <w:t xml:space="preserve">)</w:t>
-      </w:r>
-      <w:r>
-        <w:rPr>
-          <w:rStyle w:val="SpecialCharTok"/>
-        </w:rPr>
-        <w:t xml:space="preserve">+</w:t>
-      </w:r>
-      <w:r>
-        <w:br/>
-      </w:r>
-      <w:r>
-        <w:rPr>
-          <w:rStyle w:val="NormalTok"/>
-        </w:rPr>
-        <w:t xml:space="preserve">  </w:t>
-      </w:r>
-      <w:r>
-        <w:rPr>
-          <w:rStyle w:val="FunctionTok"/>
-        </w:rPr>
-        <w:t xml:space="preserve">ggtitle</w:t>
-      </w:r>
-      <w:r>
-        <w:rPr>
-          <w:rStyle w:val="NormalTok"/>
-        </w:rPr>
-        <w:t xml:space="preserve">(</w:t>
-      </w:r>
-      <w:r>
-        <w:rPr>
-          <w:rStyle w:val="StringTok"/>
-        </w:rPr>
-        <w:t xml:space="preserve">"2021 Hibernacula Substrate Species Observations"</w:t>
-      </w:r>
-      <w:r>
-        <w:rPr>
-          <w:rStyle w:val="NormalTok"/>
-        </w:rPr>
-        <w:t xml:space="preserve">)</w:t>
-      </w:r>
-      <w:r>
-        <w:rPr>
-          <w:rStyle w:val="SpecialCharTok"/>
-        </w:rPr>
-        <w:t xml:space="preserve">+</w:t>
-      </w:r>
-      <w:r>
-        <w:br/>
-      </w:r>
-      <w:r>
-        <w:rPr>
-          <w:rStyle w:val="NormalTok"/>
-        </w:rPr>
-        <w:t xml:space="preserve">  </w:t>
-      </w:r>
-      <w:r>
-        <w:rPr>
-          <w:rStyle w:val="FunctionTok"/>
-        </w:rPr>
-        <w:t xml:space="preserve">theme_light</w:t>
-      </w:r>
-      <w:r>
-        <w:rPr>
-          <w:rStyle w:val="NormalTok"/>
-        </w:rPr>
-        <w:t xml:space="preserve">()</w:t>
-      </w:r>
-      <w:r>
-        <w:rPr>
-          <w:rStyle w:val="SpecialCharTok"/>
-        </w:rPr>
-        <w:t xml:space="preserve">+</w:t>
-      </w:r>
-      <w:r>
-        <w:br/>
-      </w:r>
-      <w:r>
-        <w:rPr>
-          <w:rStyle w:val="NormalTok"/>
-        </w:rPr>
-        <w:t xml:space="preserve">  </w:t>
-      </w:r>
-      <w:r>
-        <w:rPr>
-          <w:rStyle w:val="FunctionTok"/>
-        </w:rPr>
-        <w:t xml:space="preserve">theme</w:t>
-      </w:r>
-      <w:r>
-        <w:rPr>
-          <w:rStyle w:val="NormalTok"/>
-        </w:rPr>
-        <w:t xml:space="preserve">(</w:t>
-      </w:r>
-      <w:r>
-        <w:rPr>
-          <w:rStyle w:val="AttributeTok"/>
-        </w:rPr>
-        <w:t xml:space="preserve">axis.ticks.x =</w:t>
-      </w:r>
-      <w:r>
-        <w:rPr>
-          <w:rStyle w:val="NormalTok"/>
-        </w:rPr>
-        <w:t xml:space="preserve"> </w:t>
-      </w:r>
-      <w:r>
-        <w:rPr>
-          <w:rStyle w:val="FunctionTok"/>
-        </w:rPr>
-        <w:t xml:space="preserve">element_blank</w:t>
-      </w:r>
-      <w:r>
-        <w:rPr>
-          <w:rStyle w:val="NormalTok"/>
-        </w:rPr>
-        <w:t xml:space="preserve">(),</w:t>
-      </w:r>
-      <w:r>
-        <w:rPr>
-          <w:rStyle w:val="AttributeTok"/>
-        </w:rPr>
-        <w:t xml:space="preserve">axis.text.x =</w:t>
-      </w:r>
-      <w:r>
-        <w:rPr>
-          <w:rStyle w:val="NormalTok"/>
-        </w:rPr>
-        <w:t xml:space="preserve"> </w:t>
-      </w:r>
-      <w:r>
-        <w:rPr>
-          <w:rStyle w:val="FunctionTok"/>
-        </w:rPr>
-        <w:t xml:space="preserve">element_blank</w:t>
-      </w:r>
-      <w:r>
-        <w:rPr>
-          <w:rStyle w:val="NormalTok"/>
-        </w:rPr>
-        <w:t xml:space="preserve">(),</w:t>
-      </w:r>
-      <w:r>
-        <w:br/>
-      </w:r>
-      <w:r>
-        <w:rPr>
-          <w:rStyle w:val="NormalTok"/>
-        </w:rPr>
-        <w:t xml:space="preserve">        </w:t>
-      </w:r>
-      <w:r>
-        <w:rPr>
-          <w:rStyle w:val="AttributeTok"/>
-        </w:rPr>
-        <w:t xml:space="preserve">legend.title =</w:t>
-      </w:r>
-      <w:r>
-        <w:rPr>
-          <w:rStyle w:val="NormalTok"/>
-        </w:rPr>
-        <w:t xml:space="preserve"> </w:t>
-      </w:r>
-      <w:r>
-        <w:rPr>
-          <w:rStyle w:val="FunctionTok"/>
-        </w:rPr>
-        <w:t xml:space="preserve">element_blank</w:t>
-      </w:r>
-      <w:r>
-        <w:rPr>
-          <w:rStyle w:val="NormalTok"/>
-        </w:rPr>
-        <w:t xml:space="preserve">(),</w:t>
-      </w:r>
-      <w:r>
-        <w:rPr>
-          <w:rStyle w:val="AttributeTok"/>
-        </w:rPr>
-        <w:t xml:space="preserve">legend.text =</w:t>
-      </w:r>
-      <w:r>
-        <w:rPr>
-          <w:rStyle w:val="NormalTok"/>
-        </w:rPr>
-        <w:t xml:space="preserve"> </w:t>
-      </w:r>
-      <w:r>
-        <w:rPr>
-          <w:rStyle w:val="FunctionTok"/>
-        </w:rPr>
-        <w:t xml:space="preserve">element_text</w:t>
-      </w:r>
-      <w:r>
-        <w:rPr>
-          <w:rStyle w:val="NormalTok"/>
-        </w:rPr>
-        <w:t xml:space="preserve">(</w:t>
-      </w:r>
-      <w:r>
-        <w:rPr>
-          <w:rStyle w:val="AttributeTok"/>
-        </w:rPr>
-        <w:t xml:space="preserve">size =</w:t>
-      </w:r>
-      <w:r>
-        <w:rPr>
-          <w:rStyle w:val="NormalTok"/>
-        </w:rPr>
-        <w:t xml:space="preserve"> </w:t>
-      </w:r>
-      <w:r>
-        <w:rPr>
-          <w:rStyle w:val="DecValTok"/>
-        </w:rPr>
-        <w:t xml:space="preserve">8</w:t>
-      </w:r>
-      <w:r>
-        <w:rPr>
-          <w:rStyle w:val="NormalTok"/>
-        </w:rPr>
-        <w:t xml:space="preserve">),</w:t>
-      </w:r>
-      <w:r>
-        <w:br/>
-      </w:r>
-      <w:r>
-        <w:rPr>
-          <w:rStyle w:val="NormalTok"/>
-        </w:rPr>
-        <w:t xml:space="preserve">        </w:t>
       </w:r>
       <w:r>
         <w:rPr>
@@ -851,6 +3604,18 @@
       </w:pPr>
       <w:r>
         <w:rPr>
+          <w:rStyle w:val="CommentTok"/>
+        </w:rPr>
+        <w:t xml:space="preserve"># plot of spcies counts for hibernacula substrate using bird survey data</w:t>
+      </w:r>
+      <w:r>
+        <w:br/>
+      </w:r>
+      <w:r>
+        <w:br/>
+      </w:r>
+      <w:r>
+        <w:rPr>
           <w:rStyle w:val="NormalTok"/>
         </w:rPr>
         <w:t xml:space="preserve">mbshibernacula </w:t>
@@ -958,37 +3723,112 @@
         <w:rPr>
           <w:rStyle w:val="AttributeTok"/>
         </w:rPr>
+        <w:t xml:space="preserve">y =</w:t>
+      </w:r>
+      <w:r>
+        <w:rPr>
+          <w:rStyle w:val="NormalTok"/>
+        </w:rPr>
+        <w:t xml:space="preserve"> Species,</w:t>
+      </w:r>
+      <w:r>
+        <w:rPr>
+          <w:rStyle w:val="AttributeTok"/>
+        </w:rPr>
         <w:t xml:space="preserve">x =</w:t>
       </w:r>
       <w:r>
         <w:rPr>
           <w:rStyle w:val="NormalTok"/>
         </w:rPr>
-        <w:t xml:space="preserve"> Species,</w:t>
+        <w:t xml:space="preserve"> Count)) </w:t>
+      </w:r>
+      <w:r>
+        <w:rPr>
+          <w:rStyle w:val="SpecialCharTok"/>
+        </w:rPr>
+        <w:t xml:space="preserve">+</w:t>
+      </w:r>
+      <w:r>
+        <w:br/>
+      </w:r>
+      <w:r>
+        <w:rPr>
+          <w:rStyle w:val="NormalTok"/>
+        </w:rPr>
+        <w:t xml:space="preserve">  </w:t>
+      </w:r>
+      <w:r>
+        <w:rPr>
+          <w:rStyle w:val="FunctionTok"/>
+        </w:rPr>
+        <w:t xml:space="preserve">geom_col</w:t>
+      </w:r>
+      <w:r>
+        <w:rPr>
+          <w:rStyle w:val="NormalTok"/>
+        </w:rPr>
+        <w:t xml:space="preserve">(</w:t>
       </w:r>
       <w:r>
         <w:rPr>
           <w:rStyle w:val="AttributeTok"/>
         </w:rPr>
-        <w:t xml:space="preserve">y =</w:t>
-      </w:r>
-      <w:r>
-        <w:rPr>
-          <w:rStyle w:val="NormalTok"/>
-        </w:rPr>
-        <w:t xml:space="preserve"> Count,</w:t>
+        <w:t xml:space="preserve">fill =</w:t>
+      </w:r>
+      <w:r>
+        <w:rPr>
+          <w:rStyle w:val="NormalTok"/>
+        </w:rPr>
+        <w:t xml:space="preserve"> </w:t>
+      </w:r>
+      <w:r>
+        <w:rPr>
+          <w:rStyle w:val="StringTok"/>
+        </w:rPr>
+        <w:t xml:space="preserve">"mediumpurple"</w:t>
+      </w:r>
+      <w:r>
+        <w:rPr>
+          <w:rStyle w:val="NormalTok"/>
+        </w:rPr>
+        <w:t xml:space="preserve">,</w:t>
       </w:r>
       <w:r>
         <w:rPr>
           <w:rStyle w:val="AttributeTok"/>
         </w:rPr>
-        <w:t xml:space="preserve">fill =</w:t>
-      </w:r>
-      <w:r>
-        <w:rPr>
-          <w:rStyle w:val="NormalTok"/>
-        </w:rPr>
-        <w:t xml:space="preserve"> Species)) </w:t>
+        <w:t xml:space="preserve">alpha =</w:t>
+      </w:r>
+      <w:r>
+        <w:rPr>
+          <w:rStyle w:val="NormalTok"/>
+        </w:rPr>
+        <w:t xml:space="preserve"> </w:t>
+      </w:r>
+      <w:r>
+        <w:rPr>
+          <w:rStyle w:val="FloatTok"/>
+        </w:rPr>
+        <w:t xml:space="preserve">0.75</w:t>
+      </w:r>
+      <w:r>
+        <w:rPr>
+          <w:rStyle w:val="NormalTok"/>
+        </w:rPr>
+        <w:t xml:space="preserve">,</w:t>
+      </w:r>
+      <w:r>
+        <w:rPr>
+          <w:rStyle w:val="AttributeTok"/>
+        </w:rPr>
+        <w:t xml:space="preserve">show.legend =</w:t>
+      </w:r>
+      <w:r>
+        <w:rPr>
+          <w:rStyle w:val="NormalTok"/>
+        </w:rPr>
+        <w:t xml:space="preserve"> F) </w:t>
       </w:r>
       <w:r>
         <w:rPr>
@@ -1009,7 +3849,7 @@
         <w:rPr>
           <w:rStyle w:val="FunctionTok"/>
         </w:rPr>
-        <w:t xml:space="preserve">geom_col</w:t>
+        <w:t xml:space="preserve">ggtitle</w:t>
       </w:r>
       <w:r>
         <w:rPr>
@@ -1019,9 +3859,99 @@
       </w:r>
       <w:r>
         <w:rPr>
+          <w:rStyle w:val="StringTok"/>
+        </w:rPr>
+        <w:t xml:space="preserve">"Hibernacula Species Composition by Bird Survey Year"</w:t>
+      </w:r>
+      <w:r>
+        <w:rPr>
+          <w:rStyle w:val="NormalTok"/>
+        </w:rPr>
+        <w:t xml:space="preserve">) </w:t>
+      </w:r>
+      <w:r>
+        <w:rPr>
+          <w:rStyle w:val="SpecialCharTok"/>
+        </w:rPr>
+        <w:t xml:space="preserve">+</w:t>
+      </w:r>
+      <w:r>
+        <w:br/>
+      </w:r>
+      <w:r>
+        <w:rPr>
+          <w:rStyle w:val="NormalTok"/>
+        </w:rPr>
+        <w:t xml:space="preserve">  </w:t>
+      </w:r>
+      <w:r>
+        <w:rPr>
+          <w:rStyle w:val="FunctionTok"/>
+        </w:rPr>
+        <w:t xml:space="preserve">theme_light</w:t>
+      </w:r>
+      <w:r>
+        <w:rPr>
+          <w:rStyle w:val="NormalTok"/>
+        </w:rPr>
+        <w:t xml:space="preserve">() </w:t>
+      </w:r>
+      <w:r>
+        <w:rPr>
+          <w:rStyle w:val="SpecialCharTok"/>
+        </w:rPr>
+        <w:t xml:space="preserve">+</w:t>
+      </w:r>
+      <w:r>
+        <w:br/>
+      </w:r>
+      <w:r>
+        <w:rPr>
+          <w:rStyle w:val="NormalTok"/>
+        </w:rPr>
+        <w:t xml:space="preserve">  </w:t>
+      </w:r>
+      <w:r>
+        <w:rPr>
+          <w:rStyle w:val="FunctionTok"/>
+        </w:rPr>
+        <w:t xml:space="preserve">theme</w:t>
+      </w:r>
+      <w:r>
+        <w:rPr>
+          <w:rStyle w:val="NormalTok"/>
+        </w:rPr>
+        <w:t xml:space="preserve">(</w:t>
+      </w:r>
+      <w:r>
+        <w:rPr>
           <w:rStyle w:val="AttributeTok"/>
         </w:rPr>
-        <w:t xml:space="preserve">alpha =</w:t>
+        <w:t xml:space="preserve">plot.title =</w:t>
+      </w:r>
+      <w:r>
+        <w:rPr>
+          <w:rStyle w:val="NormalTok"/>
+        </w:rPr>
+        <w:t xml:space="preserve"> </w:t>
+      </w:r>
+      <w:r>
+        <w:rPr>
+          <w:rStyle w:val="FunctionTok"/>
+        </w:rPr>
+        <w:t xml:space="preserve">element_text</w:t>
+      </w:r>
+      <w:r>
+        <w:rPr>
+          <w:rStyle w:val="NormalTok"/>
+        </w:rPr>
+        <w:t xml:space="preserve">(</w:t>
+      </w:r>
+      <w:r>
+        <w:rPr>
+          <w:rStyle w:val="AttributeTok"/>
+        </w:rPr>
+        <w:t xml:space="preserve">hjust =</w:t>
       </w:r>
       <w:r>
         <w:rPr>
@@ -1033,13 +3963,13 @@
         <w:rPr>
           <w:rStyle w:val="FloatTok"/>
         </w:rPr>
-        <w:t xml:space="preserve">0.9</w:t>
-      </w:r>
-      <w:r>
-        <w:rPr>
-          <w:rStyle w:val="NormalTok"/>
-        </w:rPr>
-        <w:t xml:space="preserve">) </w:t>
+        <w:t xml:space="preserve">0.5</w:t>
+      </w:r>
+      <w:r>
+        <w:rPr>
+          <w:rStyle w:val="NormalTok"/>
+        </w:rPr>
+        <w:t xml:space="preserve">)) </w:t>
       </w:r>
       <w:r>
         <w:rPr>
@@ -1060,7 +3990,7 @@
         <w:rPr>
           <w:rStyle w:val="FunctionTok"/>
         </w:rPr>
-        <w:t xml:space="preserve">ggtitle</w:t>
+        <w:t xml:space="preserve">facet_wrap</w:t>
       </w:r>
       <w:r>
         <w:rPr>
@@ -1070,333 +4000,6 @@
       </w:r>
       <w:r>
         <w:rPr>
-          <w:rStyle w:val="StringTok"/>
-        </w:rPr>
-        <w:t xml:space="preserve">"Species Composition for Hibernacula by Survey Year"</w:t>
-      </w:r>
-      <w:r>
-        <w:rPr>
-          <w:rStyle w:val="NormalTok"/>
-        </w:rPr>
-        <w:t xml:space="preserve">) </w:t>
-      </w:r>
-      <w:r>
-        <w:rPr>
-          <w:rStyle w:val="SpecialCharTok"/>
-        </w:rPr>
-        <w:t xml:space="preserve">+</w:t>
-      </w:r>
-      <w:r>
-        <w:br/>
-      </w:r>
-      <w:r>
-        <w:rPr>
-          <w:rStyle w:val="NormalTok"/>
-        </w:rPr>
-        <w:t xml:space="preserve">  </w:t>
-      </w:r>
-      <w:r>
-        <w:rPr>
-          <w:rStyle w:val="FunctionTok"/>
-        </w:rPr>
-        <w:t xml:space="preserve">theme_light</w:t>
-      </w:r>
-      <w:r>
-        <w:rPr>
-          <w:rStyle w:val="NormalTok"/>
-        </w:rPr>
-        <w:t xml:space="preserve">() </w:t>
-      </w:r>
-      <w:r>
-        <w:rPr>
-          <w:rStyle w:val="SpecialCharTok"/>
-        </w:rPr>
-        <w:t xml:space="preserve">+</w:t>
-      </w:r>
-      <w:r>
-        <w:br/>
-      </w:r>
-      <w:r>
-        <w:rPr>
-          <w:rStyle w:val="NormalTok"/>
-        </w:rPr>
-        <w:t xml:space="preserve">  </w:t>
-      </w:r>
-      <w:r>
-        <w:rPr>
-          <w:rStyle w:val="FunctionTok"/>
-        </w:rPr>
-        <w:t xml:space="preserve">theme</w:t>
-      </w:r>
-      <w:r>
-        <w:rPr>
-          <w:rStyle w:val="NormalTok"/>
-        </w:rPr>
-        <w:t xml:space="preserve">(</w:t>
-      </w:r>
-      <w:r>
-        <w:rPr>
-          <w:rStyle w:val="AttributeTok"/>
-        </w:rPr>
-        <w:t xml:space="preserve">axis.ticks.x =</w:t>
-      </w:r>
-      <w:r>
-        <w:rPr>
-          <w:rStyle w:val="NormalTok"/>
-        </w:rPr>
-        <w:t xml:space="preserve"> </w:t>
-      </w:r>
-      <w:r>
-        <w:rPr>
-          <w:rStyle w:val="FunctionTok"/>
-        </w:rPr>
-        <w:t xml:space="preserve">element_blank</w:t>
-      </w:r>
-      <w:r>
-        <w:rPr>
-          <w:rStyle w:val="NormalTok"/>
-        </w:rPr>
-        <w:t xml:space="preserve">(),</w:t>
-      </w:r>
-      <w:r>
-        <w:rPr>
-          <w:rStyle w:val="AttributeTok"/>
-        </w:rPr>
-        <w:t xml:space="preserve">axis.text.x =</w:t>
-      </w:r>
-      <w:r>
-        <w:rPr>
-          <w:rStyle w:val="NormalTok"/>
-        </w:rPr>
-        <w:t xml:space="preserve"> </w:t>
-      </w:r>
-      <w:r>
-        <w:rPr>
-          <w:rStyle w:val="FunctionTok"/>
-        </w:rPr>
-        <w:t xml:space="preserve">element_blank</w:t>
-      </w:r>
-      <w:r>
-        <w:rPr>
-          <w:rStyle w:val="NormalTok"/>
-        </w:rPr>
-        <w:t xml:space="preserve">(),</w:t>
-      </w:r>
-      <w:r>
-        <w:br/>
-      </w:r>
-      <w:r>
-        <w:rPr>
-          <w:rStyle w:val="NormalTok"/>
-        </w:rPr>
-        <w:t xml:space="preserve">        </w:t>
-      </w:r>
-      <w:r>
-        <w:rPr>
-          <w:rStyle w:val="AttributeTok"/>
-        </w:rPr>
-        <w:t xml:space="preserve">axis.title.x =</w:t>
-      </w:r>
-      <w:r>
-        <w:rPr>
-          <w:rStyle w:val="NormalTok"/>
-        </w:rPr>
-        <w:t xml:space="preserve"> </w:t>
-      </w:r>
-      <w:r>
-        <w:rPr>
-          <w:rStyle w:val="FunctionTok"/>
-        </w:rPr>
-        <w:t xml:space="preserve">element_blank</w:t>
-      </w:r>
-      <w:r>
-        <w:rPr>
-          <w:rStyle w:val="NormalTok"/>
-        </w:rPr>
-        <w:t xml:space="preserve">(),</w:t>
-      </w:r>
-      <w:r>
-        <w:rPr>
-          <w:rStyle w:val="AttributeTok"/>
-        </w:rPr>
-        <w:t xml:space="preserve">legend.title =</w:t>
-      </w:r>
-      <w:r>
-        <w:rPr>
-          <w:rStyle w:val="NormalTok"/>
-        </w:rPr>
-        <w:t xml:space="preserve"> </w:t>
-      </w:r>
-      <w:r>
-        <w:rPr>
-          <w:rStyle w:val="FunctionTok"/>
-        </w:rPr>
-        <w:t xml:space="preserve">element_text</w:t>
-      </w:r>
-      <w:r>
-        <w:rPr>
-          <w:rStyle w:val="NormalTok"/>
-        </w:rPr>
-        <w:t xml:space="preserve">(</w:t>
-      </w:r>
-      <w:r>
-        <w:rPr>
-          <w:rStyle w:val="AttributeTok"/>
-        </w:rPr>
-        <w:t xml:space="preserve">face =</w:t>
-      </w:r>
-      <w:r>
-        <w:rPr>
-          <w:rStyle w:val="NormalTok"/>
-        </w:rPr>
-        <w:t xml:space="preserve"> </w:t>
-      </w:r>
-      <w:r>
-        <w:rPr>
-          <w:rStyle w:val="StringTok"/>
-        </w:rPr>
-        <w:t xml:space="preserve">"bold"</w:t>
-      </w:r>
-      <w:r>
-        <w:rPr>
-          <w:rStyle w:val="NormalTok"/>
-        </w:rPr>
-        <w:t xml:space="preserve">),</w:t>
-      </w:r>
-      <w:r>
-        <w:br/>
-      </w:r>
-      <w:r>
-        <w:rPr>
-          <w:rStyle w:val="NormalTok"/>
-        </w:rPr>
-        <w:t xml:space="preserve">        </w:t>
-      </w:r>
-      <w:r>
-        <w:rPr>
-          <w:rStyle w:val="AttributeTok"/>
-        </w:rPr>
-        <w:t xml:space="preserve">legend.text =</w:t>
-      </w:r>
-      <w:r>
-        <w:rPr>
-          <w:rStyle w:val="NormalTok"/>
-        </w:rPr>
-        <w:t xml:space="preserve"> </w:t>
-      </w:r>
-      <w:r>
-        <w:rPr>
-          <w:rStyle w:val="FunctionTok"/>
-        </w:rPr>
-        <w:t xml:space="preserve">element_text</w:t>
-      </w:r>
-      <w:r>
-        <w:rPr>
-          <w:rStyle w:val="NormalTok"/>
-        </w:rPr>
-        <w:t xml:space="preserve">(</w:t>
-      </w:r>
-      <w:r>
-        <w:rPr>
-          <w:rStyle w:val="AttributeTok"/>
-        </w:rPr>
-        <w:t xml:space="preserve">size =</w:t>
-      </w:r>
-      <w:r>
-        <w:rPr>
-          <w:rStyle w:val="NormalTok"/>
-        </w:rPr>
-        <w:t xml:space="preserve"> </w:t>
-      </w:r>
-      <w:r>
-        <w:rPr>
-          <w:rStyle w:val="DecValTok"/>
-        </w:rPr>
-        <w:t xml:space="preserve">10</w:t>
-      </w:r>
-      <w:r>
-        <w:rPr>
-          <w:rStyle w:val="NormalTok"/>
-        </w:rPr>
-        <w:t xml:space="preserve">),</w:t>
-      </w:r>
-      <w:r>
-        <w:rPr>
-          <w:rStyle w:val="AttributeTok"/>
-        </w:rPr>
-        <w:t xml:space="preserve">plot.title =</w:t>
-      </w:r>
-      <w:r>
-        <w:rPr>
-          <w:rStyle w:val="NormalTok"/>
-        </w:rPr>
-        <w:t xml:space="preserve"> </w:t>
-      </w:r>
-      <w:r>
-        <w:rPr>
-          <w:rStyle w:val="FunctionTok"/>
-        </w:rPr>
-        <w:t xml:space="preserve">element_text</w:t>
-      </w:r>
-      <w:r>
-        <w:rPr>
-          <w:rStyle w:val="NormalTok"/>
-        </w:rPr>
-        <w:t xml:space="preserve">(</w:t>
-      </w:r>
-      <w:r>
-        <w:rPr>
-          <w:rStyle w:val="AttributeTok"/>
-        </w:rPr>
-        <w:t xml:space="preserve">hjust =</w:t>
-      </w:r>
-      <w:r>
-        <w:rPr>
-          <w:rStyle w:val="NormalTok"/>
-        </w:rPr>
-        <w:t xml:space="preserve"> </w:t>
-      </w:r>
-      <w:r>
-        <w:rPr>
-          <w:rStyle w:val="FloatTok"/>
-        </w:rPr>
-        <w:t xml:space="preserve">0.5</w:t>
-      </w:r>
-      <w:r>
-        <w:rPr>
-          <w:rStyle w:val="NormalTok"/>
-        </w:rPr>
-        <w:t xml:space="preserve">)) </w:t>
-      </w:r>
-      <w:r>
-        <w:rPr>
-          <w:rStyle w:val="SpecialCharTok"/>
-        </w:rPr>
-        <w:t xml:space="preserve">+</w:t>
-      </w:r>
-      <w:r>
-        <w:br/>
-      </w:r>
-      <w:r>
-        <w:rPr>
-          <w:rStyle w:val="NormalTok"/>
-        </w:rPr>
-        <w:t xml:space="preserve">  </w:t>
-      </w:r>
-      <w:r>
-        <w:rPr>
-          <w:rStyle w:val="FunctionTok"/>
-        </w:rPr>
-        <w:t xml:space="preserve">facet_wrap</w:t>
-      </w:r>
-      <w:r>
-        <w:rPr>
-          <w:rStyle w:val="NormalTok"/>
-        </w:rPr>
-        <w:t xml:space="preserve">(</w:t>
-      </w:r>
-      <w:r>
-        <w:rPr>
           <w:rStyle w:val="SpecialCharTok"/>
         </w:rPr>
         <w:t xml:space="preserve">~</w:t>
@@ -1406,6 +4009,90 @@
           <w:rStyle w:val="NormalTok"/>
         </w:rPr>
         <w:t xml:space="preserve"> survey_year)</w:t>
+      </w:r>
+      <w:r>
+        <w:br/>
+      </w:r>
+      <w:r>
+        <w:br/>
+      </w:r>
+      <w:r>
+        <w:rPr>
+          <w:rStyle w:val="CommentTok"/>
+        </w:rPr>
+        <w:t xml:space="preserve"># only ten total species observed for hibernacula</w:t>
+      </w:r>
+      <w:r>
+        <w:br/>
+      </w:r>
+      <w:r>
+        <w:rPr>
+          <w:rStyle w:val="CommentTok"/>
+        </w:rPr>
+        <w:t xml:space="preserve"># slight drop off of usage from 2017-2018 to 2022-2023 - 5 species down to 1</w:t>
+      </w:r>
+      <w:r>
+        <w:br/>
+      </w:r>
+      <w:r>
+        <w:rPr>
+          <w:rStyle w:val="CommentTok"/>
+        </w:rPr>
+        <w:t xml:space="preserve"># overlapping species from camera trapping data:</w:t>
+      </w:r>
+      <w:r>
+        <w:br/>
+      </w:r>
+      <w:r>
+        <w:rPr>
+          <w:rStyle w:val="CommentTok"/>
+        </w:rPr>
+        <w:t xml:space="preserve"># 1. Western Meadowlark</w:t>
+      </w:r>
+      <w:r>
+        <w:br/>
+      </w:r>
+      <w:r>
+        <w:rPr>
+          <w:rStyle w:val="CommentTok"/>
+        </w:rPr>
+        <w:t xml:space="preserve"># 2. American Crow</w:t>
+      </w:r>
+      <w:r>
+        <w:br/>
+      </w:r>
+      <w:r>
+        <w:rPr>
+          <w:rStyle w:val="CommentTok"/>
+        </w:rPr>
+        <w:t xml:space="preserve"># 3. Burrowing Owl</w:t>
+      </w:r>
+      <w:r>
+        <w:br/>
+      </w:r>
+      <w:r>
+        <w:rPr>
+          <w:rStyle w:val="CommentTok"/>
+        </w:rPr>
+        <w:t xml:space="preserve"># 4. Lark Sparrow</w:t>
+      </w:r>
+      <w:r>
+        <w:br/>
+      </w:r>
+      <w:r>
+        <w:rPr>
+          <w:rStyle w:val="CommentTok"/>
+        </w:rPr>
+        <w:t xml:space="preserve"># 5. American Pipit</w:t>
+      </w:r>
+      <w:r>
+        <w:br/>
+      </w:r>
+      <w:r>
+        <w:rPr>
+          <w:rStyle w:val="CommentTok"/>
+        </w:rPr>
+        <w:t xml:space="preserve"># does Bush Wren = Wren?</w:t>
       </w:r>
       <w:r>
         <w:br/>
@@ -3080,6 +5767,610 @@
                   </pic:nvPicPr>
                   <pic:blipFill>
                     <a:blip r:embed="rId29"/>
+                    <a:stretch>
+                      <a:fillRect/>
+                    </a:stretch>
+                  </pic:blipFill>
+                  <pic:spPr bwMode="auto">
+                    <a:xfrm>
+                      <a:off x="0" y="0"/>
+                      <a:ext cx="4620126" cy="3696101"/>
+                    </a:xfrm>
+                    <a:prstGeom prst="rect">
+                      <a:avLst/>
+                    </a:prstGeom>
+                    <a:noFill/>
+                    <a:ln w="9525">
+                      <a:noFill/>
+                      <a:headEnd/>
+                      <a:tailEnd/>
+                    </a:ln>
+                  </pic:spPr>
+                </pic:pic>
+              </a:graphicData>
+            </a:graphic>
+          </wp:inline>
+        </w:drawing>
+      </w:r>
+    </w:p>
+    <w:p>
+      <w:pPr>
+        <w:pStyle w:val="SourceCode"/>
+      </w:pPr>
+      <w:r>
+        <w:rPr>
+          <w:rStyle w:val="CommentTok"/>
+        </w:rPr>
+        <w:t xml:space="preserve"># plot of count vs season by species for hibernacula substrate, visualizing which seasons relevant species appear</w:t>
+      </w:r>
+      <w:r>
+        <w:br/>
+      </w:r>
+      <w:r>
+        <w:rPr>
+          <w:rStyle w:val="CommentTok"/>
+        </w:rPr>
+        <w:t xml:space="preserve"># would like to be able to include survey year in visualization but am not sure how</w:t>
+      </w:r>
+      <w:r>
+        <w:br/>
+      </w:r>
+      <w:r>
+        <w:br/>
+      </w:r>
+      <w:r>
+        <w:rPr>
+          <w:rStyle w:val="NormalTok"/>
+        </w:rPr>
+        <w:t xml:space="preserve">joined </w:t>
+      </w:r>
+      <w:r>
+        <w:rPr>
+          <w:rStyle w:val="SpecialCharTok"/>
+        </w:rPr>
+        <w:t xml:space="preserve">%&gt;%</w:t>
+      </w:r>
+      <w:r>
+        <w:rPr>
+          <w:rStyle w:val="NormalTok"/>
+        </w:rPr>
+        <w:t xml:space="preserve"> </w:t>
+      </w:r>
+      <w:r>
+        <w:rPr>
+          <w:rStyle w:val="FunctionTok"/>
+        </w:rPr>
+        <w:t xml:space="preserve">filter</w:t>
+      </w:r>
+      <w:r>
+        <w:rPr>
+          <w:rStyle w:val="NormalTok"/>
+        </w:rPr>
+        <w:t xml:space="preserve">(Substrate </w:t>
+      </w:r>
+      <w:r>
+        <w:rPr>
+          <w:rStyle w:val="SpecialCharTok"/>
+        </w:rPr>
+        <w:t xml:space="preserve">==</w:t>
+      </w:r>
+      <w:r>
+        <w:rPr>
+          <w:rStyle w:val="NormalTok"/>
+        </w:rPr>
+        <w:t xml:space="preserve"> </w:t>
+      </w:r>
+      <w:r>
+        <w:rPr>
+          <w:rStyle w:val="StringTok"/>
+        </w:rPr>
+        <w:t xml:space="preserve">"Habitat Feature - Hibernacula"</w:t>
+      </w:r>
+      <w:r>
+        <w:rPr>
+          <w:rStyle w:val="NormalTok"/>
+        </w:rPr>
+        <w:t xml:space="preserve">) </w:t>
+      </w:r>
+      <w:r>
+        <w:rPr>
+          <w:rStyle w:val="SpecialCharTok"/>
+        </w:rPr>
+        <w:t xml:space="preserve">%&gt;%</w:t>
+      </w:r>
+      <w:r>
+        <w:rPr>
+          <w:rStyle w:val="NormalTok"/>
+        </w:rPr>
+        <w:t xml:space="preserve"> </w:t>
+      </w:r>
+      <w:r>
+        <w:br/>
+      </w:r>
+      <w:r>
+        <w:rPr>
+          <w:rStyle w:val="NormalTok"/>
+        </w:rPr>
+        <w:t xml:space="preserve">  </w:t>
+      </w:r>
+      <w:r>
+        <w:rPr>
+          <w:rStyle w:val="FunctionTok"/>
+        </w:rPr>
+        <w:t xml:space="preserve">ggplot</w:t>
+      </w:r>
+      <w:r>
+        <w:rPr>
+          <w:rStyle w:val="NormalTok"/>
+        </w:rPr>
+        <w:t xml:space="preserve">(</w:t>
+      </w:r>
+      <w:r>
+        <w:rPr>
+          <w:rStyle w:val="FunctionTok"/>
+        </w:rPr>
+        <w:t xml:space="preserve">aes</w:t>
+      </w:r>
+      <w:r>
+        <w:rPr>
+          <w:rStyle w:val="NormalTok"/>
+        </w:rPr>
+        <w:t xml:space="preserve">(</w:t>
+      </w:r>
+      <w:r>
+        <w:rPr>
+          <w:rStyle w:val="AttributeTok"/>
+        </w:rPr>
+        <w:t xml:space="preserve">y =</w:t>
+      </w:r>
+      <w:r>
+        <w:rPr>
+          <w:rStyle w:val="NormalTok"/>
+        </w:rPr>
+        <w:t xml:space="preserve"> Count,</w:t>
+      </w:r>
+      <w:r>
+        <w:rPr>
+          <w:rStyle w:val="AttributeTok"/>
+        </w:rPr>
+        <w:t xml:space="preserve">x =</w:t>
+      </w:r>
+      <w:r>
+        <w:rPr>
+          <w:rStyle w:val="NormalTok"/>
+        </w:rPr>
+        <w:t xml:space="preserve"> season)) </w:t>
+      </w:r>
+      <w:r>
+        <w:rPr>
+          <w:rStyle w:val="SpecialCharTok"/>
+        </w:rPr>
+        <w:t xml:space="preserve">+</w:t>
+      </w:r>
+      <w:r>
+        <w:br/>
+      </w:r>
+      <w:r>
+        <w:rPr>
+          <w:rStyle w:val="NormalTok"/>
+        </w:rPr>
+        <w:t xml:space="preserve">  </w:t>
+      </w:r>
+      <w:r>
+        <w:rPr>
+          <w:rStyle w:val="FunctionTok"/>
+        </w:rPr>
+        <w:t xml:space="preserve">geom_col</w:t>
+      </w:r>
+      <w:r>
+        <w:rPr>
+          <w:rStyle w:val="NormalTok"/>
+        </w:rPr>
+        <w:t xml:space="preserve">(</w:t>
+      </w:r>
+      <w:r>
+        <w:rPr>
+          <w:rStyle w:val="AttributeTok"/>
+        </w:rPr>
+        <w:t xml:space="preserve">fill =</w:t>
+      </w:r>
+      <w:r>
+        <w:rPr>
+          <w:rStyle w:val="NormalTok"/>
+        </w:rPr>
+        <w:t xml:space="preserve"> </w:t>
+      </w:r>
+      <w:r>
+        <w:rPr>
+          <w:rStyle w:val="StringTok"/>
+        </w:rPr>
+        <w:t xml:space="preserve">"darkorange"</w:t>
+      </w:r>
+      <w:r>
+        <w:rPr>
+          <w:rStyle w:val="NormalTok"/>
+        </w:rPr>
+        <w:t xml:space="preserve">,</w:t>
+      </w:r>
+      <w:r>
+        <w:rPr>
+          <w:rStyle w:val="AttributeTok"/>
+        </w:rPr>
+        <w:t xml:space="preserve">alpha =</w:t>
+      </w:r>
+      <w:r>
+        <w:rPr>
+          <w:rStyle w:val="NormalTok"/>
+        </w:rPr>
+        <w:t xml:space="preserve"> </w:t>
+      </w:r>
+      <w:r>
+        <w:rPr>
+          <w:rStyle w:val="FloatTok"/>
+        </w:rPr>
+        <w:t xml:space="preserve">0.75</w:t>
+      </w:r>
+      <w:r>
+        <w:rPr>
+          <w:rStyle w:val="NormalTok"/>
+        </w:rPr>
+        <w:t xml:space="preserve">,</w:t>
+      </w:r>
+      <w:r>
+        <w:rPr>
+          <w:rStyle w:val="AttributeTok"/>
+        </w:rPr>
+        <w:t xml:space="preserve">show.legend =</w:t>
+      </w:r>
+      <w:r>
+        <w:rPr>
+          <w:rStyle w:val="NormalTok"/>
+        </w:rPr>
+        <w:t xml:space="preserve"> F) </w:t>
+      </w:r>
+      <w:r>
+        <w:rPr>
+          <w:rStyle w:val="SpecialCharTok"/>
+        </w:rPr>
+        <w:t xml:space="preserve">+</w:t>
+      </w:r>
+      <w:r>
+        <w:br/>
+      </w:r>
+      <w:r>
+        <w:rPr>
+          <w:rStyle w:val="NormalTok"/>
+        </w:rPr>
+        <w:t xml:space="preserve">  </w:t>
+      </w:r>
+      <w:r>
+        <w:rPr>
+          <w:rStyle w:val="FunctionTok"/>
+        </w:rPr>
+        <w:t xml:space="preserve">labs</w:t>
+      </w:r>
+      <w:r>
+        <w:rPr>
+          <w:rStyle w:val="NormalTok"/>
+        </w:rPr>
+        <w:t xml:space="preserve">(</w:t>
+      </w:r>
+      <w:r>
+        <w:rPr>
+          <w:rStyle w:val="AttributeTok"/>
+        </w:rPr>
+        <w:t xml:space="preserve">x =</w:t>
+      </w:r>
+      <w:r>
+        <w:rPr>
+          <w:rStyle w:val="NormalTok"/>
+        </w:rPr>
+        <w:t xml:space="preserve"> </w:t>
+      </w:r>
+      <w:r>
+        <w:rPr>
+          <w:rStyle w:val="StringTok"/>
+        </w:rPr>
+        <w:t xml:space="preserve">"Season"</w:t>
+      </w:r>
+      <w:r>
+        <w:rPr>
+          <w:rStyle w:val="NormalTok"/>
+        </w:rPr>
+        <w:t xml:space="preserve">,</w:t>
+      </w:r>
+      <w:r>
+        <w:rPr>
+          <w:rStyle w:val="AttributeTok"/>
+        </w:rPr>
+        <w:t xml:space="preserve">title =</w:t>
+      </w:r>
+      <w:r>
+        <w:rPr>
+          <w:rStyle w:val="NormalTok"/>
+        </w:rPr>
+        <w:t xml:space="preserve"> </w:t>
+      </w:r>
+      <w:r>
+        <w:rPr>
+          <w:rStyle w:val="StringTok"/>
+        </w:rPr>
+        <w:t xml:space="preserve">"Count of Hibernacula Species by Season"</w:t>
+      </w:r>
+      <w:r>
+        <w:rPr>
+          <w:rStyle w:val="NormalTok"/>
+        </w:rPr>
+        <w:t xml:space="preserve">) </w:t>
+      </w:r>
+      <w:r>
+        <w:rPr>
+          <w:rStyle w:val="SpecialCharTok"/>
+        </w:rPr>
+        <w:t xml:space="preserve">+</w:t>
+      </w:r>
+      <w:r>
+        <w:br/>
+      </w:r>
+      <w:r>
+        <w:rPr>
+          <w:rStyle w:val="NormalTok"/>
+        </w:rPr>
+        <w:t xml:space="preserve">  </w:t>
+      </w:r>
+      <w:r>
+        <w:rPr>
+          <w:rStyle w:val="FunctionTok"/>
+        </w:rPr>
+        <w:t xml:space="preserve">theme_light</w:t>
+      </w:r>
+      <w:r>
+        <w:rPr>
+          <w:rStyle w:val="NormalTok"/>
+        </w:rPr>
+        <w:t xml:space="preserve">() </w:t>
+      </w:r>
+      <w:r>
+        <w:rPr>
+          <w:rStyle w:val="SpecialCharTok"/>
+        </w:rPr>
+        <w:t xml:space="preserve">+</w:t>
+      </w:r>
+      <w:r>
+        <w:br/>
+      </w:r>
+      <w:r>
+        <w:rPr>
+          <w:rStyle w:val="NormalTok"/>
+        </w:rPr>
+        <w:t xml:space="preserve">  </w:t>
+      </w:r>
+      <w:r>
+        <w:rPr>
+          <w:rStyle w:val="FunctionTok"/>
+        </w:rPr>
+        <w:t xml:space="preserve">theme</w:t>
+      </w:r>
+      <w:r>
+        <w:rPr>
+          <w:rStyle w:val="NormalTok"/>
+        </w:rPr>
+        <w:t xml:space="preserve">(</w:t>
+      </w:r>
+      <w:r>
+        <w:rPr>
+          <w:rStyle w:val="AttributeTok"/>
+        </w:rPr>
+        <w:t xml:space="preserve">axis.text.x =</w:t>
+      </w:r>
+      <w:r>
+        <w:rPr>
+          <w:rStyle w:val="NormalTok"/>
+        </w:rPr>
+        <w:t xml:space="preserve"> </w:t>
+      </w:r>
+      <w:r>
+        <w:rPr>
+          <w:rStyle w:val="FunctionTok"/>
+        </w:rPr>
+        <w:t xml:space="preserve">element_text</w:t>
+      </w:r>
+      <w:r>
+        <w:rPr>
+          <w:rStyle w:val="NormalTok"/>
+        </w:rPr>
+        <w:t xml:space="preserve">(</w:t>
+      </w:r>
+      <w:r>
+        <w:rPr>
+          <w:rStyle w:val="AttributeTok"/>
+        </w:rPr>
+        <w:t xml:space="preserve">angle =</w:t>
+      </w:r>
+      <w:r>
+        <w:rPr>
+          <w:rStyle w:val="NormalTok"/>
+        </w:rPr>
+        <w:t xml:space="preserve"> </w:t>
+      </w:r>
+      <w:r>
+        <w:rPr>
+          <w:rStyle w:val="DecValTok"/>
+        </w:rPr>
+        <w:t xml:space="preserve">90</w:t>
+      </w:r>
+      <w:r>
+        <w:rPr>
+          <w:rStyle w:val="NormalTok"/>
+        </w:rPr>
+        <w:t xml:space="preserve">,</w:t>
+      </w:r>
+      <w:r>
+        <w:rPr>
+          <w:rStyle w:val="AttributeTok"/>
+        </w:rPr>
+        <w:t xml:space="preserve">hjust =</w:t>
+      </w:r>
+      <w:r>
+        <w:rPr>
+          <w:rStyle w:val="NormalTok"/>
+        </w:rPr>
+        <w:t xml:space="preserve"> </w:t>
+      </w:r>
+      <w:r>
+        <w:rPr>
+          <w:rStyle w:val="DecValTok"/>
+        </w:rPr>
+        <w:t xml:space="preserve">1</w:t>
+      </w:r>
+      <w:r>
+        <w:rPr>
+          <w:rStyle w:val="NormalTok"/>
+        </w:rPr>
+        <w:t xml:space="preserve">,</w:t>
+      </w:r>
+      <w:r>
+        <w:rPr>
+          <w:rStyle w:val="AttributeTok"/>
+        </w:rPr>
+        <w:t xml:space="preserve">vjust =</w:t>
+      </w:r>
+      <w:r>
+        <w:rPr>
+          <w:rStyle w:val="NormalTok"/>
+        </w:rPr>
+        <w:t xml:space="preserve"> </w:t>
+      </w:r>
+      <w:r>
+        <w:rPr>
+          <w:rStyle w:val="FloatTok"/>
+        </w:rPr>
+        <w:t xml:space="preserve">0.5</w:t>
+      </w:r>
+      <w:r>
+        <w:rPr>
+          <w:rStyle w:val="NormalTok"/>
+        </w:rPr>
+        <w:t xml:space="preserve">),</w:t>
+      </w:r>
+      <w:r>
+        <w:br/>
+      </w:r>
+      <w:r>
+        <w:rPr>
+          <w:rStyle w:val="NormalTok"/>
+        </w:rPr>
+        <w:t xml:space="preserve">        </w:t>
+      </w:r>
+      <w:r>
+        <w:rPr>
+          <w:rStyle w:val="AttributeTok"/>
+        </w:rPr>
+        <w:t xml:space="preserve">plot.title =</w:t>
+      </w:r>
+      <w:r>
+        <w:rPr>
+          <w:rStyle w:val="NormalTok"/>
+        </w:rPr>
+        <w:t xml:space="preserve"> </w:t>
+      </w:r>
+      <w:r>
+        <w:rPr>
+          <w:rStyle w:val="FunctionTok"/>
+        </w:rPr>
+        <w:t xml:space="preserve">element_text</w:t>
+      </w:r>
+      <w:r>
+        <w:rPr>
+          <w:rStyle w:val="NormalTok"/>
+        </w:rPr>
+        <w:t xml:space="preserve">(</w:t>
+      </w:r>
+      <w:r>
+        <w:rPr>
+          <w:rStyle w:val="AttributeTok"/>
+        </w:rPr>
+        <w:t xml:space="preserve">hjust =</w:t>
+      </w:r>
+      <w:r>
+        <w:rPr>
+          <w:rStyle w:val="NormalTok"/>
+        </w:rPr>
+        <w:t xml:space="preserve"> </w:t>
+      </w:r>
+      <w:r>
+        <w:rPr>
+          <w:rStyle w:val="FloatTok"/>
+        </w:rPr>
+        <w:t xml:space="preserve">0.5</w:t>
+      </w:r>
+      <w:r>
+        <w:rPr>
+          <w:rStyle w:val="NormalTok"/>
+        </w:rPr>
+        <w:t xml:space="preserve">)) </w:t>
+      </w:r>
+      <w:r>
+        <w:rPr>
+          <w:rStyle w:val="SpecialCharTok"/>
+        </w:rPr>
+        <w:t xml:space="preserve">+</w:t>
+      </w:r>
+      <w:r>
+        <w:br/>
+      </w:r>
+      <w:r>
+        <w:rPr>
+          <w:rStyle w:val="NormalTok"/>
+        </w:rPr>
+        <w:t xml:space="preserve">  </w:t>
+      </w:r>
+      <w:r>
+        <w:rPr>
+          <w:rStyle w:val="FunctionTok"/>
+        </w:rPr>
+        <w:t xml:space="preserve">facet_wrap</w:t>
+      </w:r>
+      <w:r>
+        <w:rPr>
+          <w:rStyle w:val="NormalTok"/>
+        </w:rPr>
+        <w:t xml:space="preserve">(</w:t>
+      </w:r>
+      <w:r>
+        <w:rPr>
+          <w:rStyle w:val="SpecialCharTok"/>
+        </w:rPr>
+        <w:t xml:space="preserve">~</w:t>
+      </w:r>
+      <w:r>
+        <w:rPr>
+          <w:rStyle w:val="NormalTok"/>
+        </w:rPr>
+        <w:t xml:space="preserve"> Species)</w:t>
+      </w:r>
+    </w:p>
+    <w:p>
+      <w:pPr>
+        <w:pStyle w:val="FirstParagraph"/>
+      </w:pPr>
+      <w:r>
+        <w:drawing>
+          <wp:inline>
+            <wp:extent cx="4620126" cy="3696101"/>
+            <wp:effectExtent b="0" l="0" r="0" t="0"/>
+            <wp:docPr descr="" title="" id="33" name="Picture"/>
+            <a:graphic>
+              <a:graphicData uri="http://schemas.openxmlformats.org/drawingml/2006/picture">
+                <pic:pic>
+                  <pic:nvPicPr>
+                    <pic:cNvPr descr="MV_2025-09-06_files/figure-docx/unnamed-chunk-6-1.png" id="34" name="Picture"/>
+                    <pic:cNvPicPr>
+                      <a:picLocks noChangeArrowheads="1" noChangeAspect="1"/>
+                    </pic:cNvPicPr>
+                  </pic:nvPicPr>
+                  <pic:blipFill>
+                    <a:blip r:embed="rId32"/>
                     <a:stretch>
                       <a:fillRect/>
                     </a:stretch>

</xml_diff>